<commit_message>
Make the runbook, handout, server list and checks agree on the post-demo state
The runbook now says production shows Queued until stage is green, which
is what GitHub does with max-parallel 1 and what the handout already
said. validate.sh and doc 6 expect nine containers with 323 built, so
running the checks during questions prints no false failures. Doc 5
lists app-prod-3.

Co-Authored-By: Claude Fable 5.1 <noreply@anthropic.com>
</commit_message>
<xml_diff>
--- a/docs/word/1-RUNBOOK.docx
+++ b/docs/word/1-RUNBOOK.docx
@@ -4355,7 +4355,99 @@
         <w:rPr>
           <w:rStyle w:val="VerbatimChar"/>
         </w:rPr>
-        <w:t xml:space="preserve">Deploy (prod)    Waiting for review</w:t>
+        <w:t xml:space="preserve">Deploy (prod)    Queued</w:t>
+      </w:r>
+    </w:p>
+    <w:p>
+      <w:pPr>
+        <w:pStyle w:val="FirstParagraph"/>
+      </w:pPr>
+      <w:r>
+        <w:rPr>
+          <w:b/>
+          <w:bCs/>
+        </w:rPr>
+        <w:t xml:space="preserve">Prod says</w:t>
+      </w:r>
+      <w:r>
+        <w:rPr>
+          <w:b/>
+          <w:bCs/>
+        </w:rPr>
+        <w:t xml:space="preserve"> </w:t>
+      </w:r>
+      <w:r>
+        <w:rPr>
+          <w:b/>
+          <w:bCs/>
+          <w:i/>
+          <w:iCs/>
+        </w:rPr>
+        <w:t xml:space="preserve">Queued</w:t>
+      </w:r>
+      <w:r>
+        <w:rPr>
+          <w:b/>
+          <w:bCs/>
+        </w:rPr>
+        <w:t xml:space="preserve">, not</w:t>
+      </w:r>
+      <w:r>
+        <w:rPr>
+          <w:b/>
+          <w:bCs/>
+        </w:rPr>
+        <w:t xml:space="preserve"> </w:t>
+      </w:r>
+      <w:r>
+        <w:rPr>
+          <w:b/>
+          <w:bCs/>
+          <w:i/>
+          <w:iCs/>
+        </w:rPr>
+        <w:t xml:space="preserve">Waiting</w:t>
+      </w:r>
+      <w:r>
+        <w:rPr>
+          <w:b/>
+          <w:bCs/>
+        </w:rPr>
+        <w:t xml:space="preserve">, until stage has finished.</w:t>
+      </w:r>
+      <w:r>
+        <w:t xml:space="preserve"> </w:t>
+      </w:r>
+      <w:r>
+        <w:t xml:space="preserve">The deploys run one at a time, in</w:t>
+      </w:r>
+      <w:r>
+        <w:t xml:space="preserve"> </w:t>
+      </w:r>
+      <w:r>
+        <w:t xml:space="preserve">order. It flips to</w:t>
+      </w:r>
+      <w:r>
+        <w:t xml:space="preserve"> </w:t>
+      </w:r>
+      <w:r>
+        <w:rPr>
+          <w:i/>
+          <w:iCs/>
+        </w:rPr>
+        <w:t xml:space="preserve">Waiting for review</w:t>
+      </w:r>
+      <w:r>
+        <w:t xml:space="preserve"> </w:t>
+      </w:r>
+      <w:r>
+        <w:t xml:space="preserve">on its own once stage is green. Do not read "Queued" as a</w:t>
+      </w:r>
+      <w:r>
+        <w:t xml:space="preserve"> </w:t>
+      </w:r>
+      <w:r>
+        <w:t xml:space="preserve">problem.</w:t>
       </w:r>
     </w:p>
     <w:p>
@@ -4363,7 +4455,13 @@
         <w:pStyle w:val="BlockText"/>
       </w:pPr>
       <w:r>
-        <w:t xml:space="preserve">"Development went out by itself. Staging and production stopped."</w:t>
+        <w:t xml:space="preserve">"Development went out by itself. Staging stopped and is asking for a person. Production is queued</w:t>
+      </w:r>
+      <w:r>
+        <w:t xml:space="preserve"> </w:t>
+      </w:r>
+      <w:r>
+        <w:t xml:space="preserve">behind it - it will not even ask until staging is done."</w:t>
       </w:r>
     </w:p>
     <w:p>
@@ -4438,7 +4536,30 @@
           <w:b/>
           <w:bCs/>
         </w:rPr>
-        <w:t xml:space="preserve">Then approve production the same way.</w:t>
+        <w:t xml:space="preserve">Then, once stage is green, production flips to</w:t>
+      </w:r>
+      <w:r>
+        <w:rPr>
+          <w:b/>
+          <w:bCs/>
+        </w:rPr>
+        <w:t xml:space="preserve"> </w:t>
+      </w:r>
+      <w:r>
+        <w:rPr>
+          <w:b/>
+          <w:bCs/>
+          <w:i/>
+          <w:iCs/>
+        </w:rPr>
+        <w:t xml:space="preserve">Waiting for review</w:t>
+      </w:r>
+      <w:r>
+        <w:rPr>
+          <w:b/>
+          <w:bCs/>
+        </w:rPr>
+        <w:t xml:space="preserve">. Approve it the same way.</w:t>
       </w:r>
     </w:p>
     <w:p>

</xml_diff>

<commit_message>
Give every demo step a spoken lead-in to read as the window changes
Co-Authored-By: Claude Fable 5.1 <noreply@anthropic.com>
</commit_message>
<xml_diff>
--- a/docs/word/1-RUNBOOK.docx
+++ b/docs/word/1-RUNBOOK.docx
@@ -3321,6 +3321,32 @@
           <w:b/>
           <w:bCs/>
         </w:rPr>
+        <w:t xml:space="preserve">Say, as I start:</w:t>
+      </w:r>
+    </w:p>
+    <w:p>
+      <w:pPr>
+        <w:pStyle w:val="BlockText"/>
+      </w:pPr>
+      <w:r>
+        <w:t xml:space="preserve">"Before I show you anything, I want to tell you how this started. It's a story about one</w:t>
+      </w:r>
+      <w:r>
+        <w:t xml:space="preserve"> </w:t>
+      </w:r>
+      <w:r>
+        <w:t xml:space="preserve">repository, and it's the reason everything you'll see today exists. I'll keep it short."</w:t>
+      </w:r>
+    </w:p>
+    <w:p>
+      <w:pPr>
+        <w:pStyle w:val="FirstParagraph"/>
+      </w:pPr>
+      <w:r>
+        <w:rPr>
+          <w:b/>
+          <w:bCs/>
+        </w:rPr>
         <w:t xml:space="preserve">Nothing shared. Just talk.</w:t>
       </w:r>
     </w:p>
@@ -3470,6 +3496,32 @@
           <w:b/>
           <w:bCs/>
         </w:rPr>
+        <w:t xml:space="preserve">Say, as I start:</w:t>
+      </w:r>
+    </w:p>
+    <w:p>
+      <w:pPr>
+        <w:pStyle w:val="BlockText"/>
+      </w:pPr>
+      <w:r>
+        <w:t xml:space="preserve">"The second repository is the more interesting one, because that team noticed. And they did what</w:t>
+      </w:r>
+      <w:r>
+        <w:t xml:space="preserve"> </w:t>
+      </w:r>
+      <w:r>
+        <w:t xml:space="preserve">every team does when they notice."</w:t>
+      </w:r>
+    </w:p>
+    <w:p>
+      <w:pPr>
+        <w:pStyle w:val="FirstParagraph"/>
+      </w:pPr>
+      <w:r>
+        <w:rPr>
+          <w:b/>
+          <w:bCs/>
+        </w:rPr>
         <w:t xml:space="preserve">Still nothing shared.</w:t>
       </w:r>
     </w:p>
@@ -3576,44 +3628,21 @@
           <w:b/>
           <w:bCs/>
         </w:rPr>
-        <w:t xml:space="preserve">Share the SERVER window.</w:t>
-      </w:r>
-    </w:p>
-    <w:p>
-      <w:pPr>
-        <w:pStyle w:val="SourceCode"/>
-      </w:pPr>
-      <w:r>
-        <w:rPr>
-          <w:rStyle w:val="ExtensionTok"/>
-        </w:rPr>
-        <w:t xml:space="preserve">/root/demo-secret-persistence.sh</w:t>
-      </w:r>
-    </w:p>
-    <w:p>
-      <w:pPr>
-        <w:pStyle w:val="FirstParagraph"/>
-      </w:pPr>
-      <w:r>
-        <w:t xml:space="preserve">It stops after each step and waits.</w:t>
-      </w:r>
-      <w:r>
-        <w:t xml:space="preserve"> </w:t>
-      </w:r>
-      <w:r>
-        <w:rPr>
-          <w:b/>
-          <w:bCs/>
-        </w:rPr>
-        <w:t xml:space="preserve">Press enter to move on.</w:t>
-      </w:r>
-    </w:p>
-    <w:p>
-      <w:pPr>
-        <w:pStyle w:val="BodyText"/>
-      </w:pPr>
-      <w:r>
-        <w:t xml:space="preserve">Talk over the first four steps:</w:t>
+        <w:t xml:space="preserve">Say, as I share the server window:</w:t>
+      </w:r>
+    </w:p>
+    <w:p>
+      <w:pPr>
+        <w:pStyle w:val="BlockText"/>
+      </w:pPr>
+      <w:r>
+        <w:t xml:space="preserve">"Let me show you what that fix actually achieved. This is a throwaway repository on my server. It</w:t>
+      </w:r>
+      <w:r>
+        <w:t xml:space="preserve"> </w:t>
+      </w:r>
+      <w:r>
+        <w:t xml:space="preserve">is going to commit a password, delete it, ignore it, encrypt it - the three fixes that team applied</w:t>
       </w:r>
     </w:p>
     <w:p>
@@ -3625,17 +3654,56 @@
         </w:numPr>
       </w:pPr>
       <w:r>
-        <w:rPr>
-          <w:b/>
-          <w:bCs/>
-        </w:rPr>
-        <w:t xml:space="preserve">Setup</w:t>
-      </w:r>
-      <w:r>
-        <w:t xml:space="preserve"> </w:t>
-      </w:r>
-      <w:r>
-        <w:t xml:space="preserve">- "an ordinary repository, with a .env in it"</w:t>
+        <w:t xml:space="preserve">and then I'll show you the password is still there. Press-enter pauses; I'll narrate."</w:t>
+      </w:r>
+    </w:p>
+    <w:p>
+      <w:pPr>
+        <w:pStyle w:val="FirstParagraph"/>
+      </w:pPr>
+      <w:r>
+        <w:rPr>
+          <w:b/>
+          <w:bCs/>
+        </w:rPr>
+        <w:t xml:space="preserve">Share the SERVER window.</w:t>
+      </w:r>
+    </w:p>
+    <w:p>
+      <w:pPr>
+        <w:pStyle w:val="SourceCode"/>
+      </w:pPr>
+      <w:r>
+        <w:rPr>
+          <w:rStyle w:val="ExtensionTok"/>
+        </w:rPr>
+        <w:t xml:space="preserve">/root/demo-secret-persistence.sh</w:t>
+      </w:r>
+    </w:p>
+    <w:p>
+      <w:pPr>
+        <w:pStyle w:val="FirstParagraph"/>
+      </w:pPr>
+      <w:r>
+        <w:t xml:space="preserve">It stops after each step and waits.</w:t>
+      </w:r>
+      <w:r>
+        <w:t xml:space="preserve"> </w:t>
+      </w:r>
+      <w:r>
+        <w:rPr>
+          <w:b/>
+          <w:bCs/>
+        </w:rPr>
+        <w:t xml:space="preserve">Press enter to move on.</w:t>
+      </w:r>
+    </w:p>
+    <w:p>
+      <w:pPr>
+        <w:pStyle w:val="BodyText"/>
+      </w:pPr>
+      <w:r>
+        <w:t xml:space="preserve">Talk over the first four steps:</w:t>
       </w:r>
     </w:p>
     <w:p>
@@ -3643,7 +3711,7 @@
         <w:pStyle w:val="Compact"/>
         <w:numPr>
           <w:ilvl w:val="0"/>
-          <w:numId w:val="1005"/>
+          <w:numId w:val="1006"/>
         </w:numPr>
       </w:pPr>
       <w:r>
@@ -3651,13 +3719,13 @@
           <w:b/>
           <w:bCs/>
         </w:rPr>
-        <w:t xml:space="preserve">Fix 1</w:t>
-      </w:r>
-      <w:r>
-        <w:t xml:space="preserve"> </w:t>
-      </w:r>
-      <w:r>
-        <w:t xml:space="preserve">- "first instinct, delete the file"</w:t>
+        <w:t xml:space="preserve">Setup</w:t>
+      </w:r>
+      <w:r>
+        <w:t xml:space="preserve"> </w:t>
+      </w:r>
+      <w:r>
+        <w:t xml:space="preserve">- "an ordinary repository, with a .env in it"</w:t>
       </w:r>
     </w:p>
     <w:p>
@@ -3665,7 +3733,7 @@
         <w:pStyle w:val="Compact"/>
         <w:numPr>
           <w:ilvl w:val="0"/>
-          <w:numId w:val="1005"/>
+          <w:numId w:val="1006"/>
         </w:numPr>
       </w:pPr>
       <w:r>
@@ -3673,13 +3741,13 @@
           <w:b/>
           <w:bCs/>
         </w:rPr>
-        <w:t xml:space="preserve">Fix 2</w:t>
-      </w:r>
-      <w:r>
-        <w:t xml:space="preserve"> </w:t>
-      </w:r>
-      <w:r>
-        <w:t xml:space="preserve">- "then make sure it cannot come back"</w:t>
+        <w:t xml:space="preserve">Fix 1</w:t>
+      </w:r>
+      <w:r>
+        <w:t xml:space="preserve"> </w:t>
+      </w:r>
+      <w:r>
+        <w:t xml:space="preserve">- "first instinct, delete the file"</w:t>
       </w:r>
     </w:p>
     <w:p>
@@ -3687,7 +3755,29 @@
         <w:pStyle w:val="Compact"/>
         <w:numPr>
           <w:ilvl w:val="0"/>
-          <w:numId w:val="1005"/>
+          <w:numId w:val="1006"/>
+        </w:numPr>
+      </w:pPr>
+      <w:r>
+        <w:rPr>
+          <w:b/>
+          <w:bCs/>
+        </w:rPr>
+        <w:t xml:space="preserve">Fix 2</w:t>
+      </w:r>
+      <w:r>
+        <w:t xml:space="preserve"> </w:t>
+      </w:r>
+      <w:r>
+        <w:t xml:space="preserve">- "then make sure it cannot come back"</w:t>
+      </w:r>
+    </w:p>
+    <w:p>
+      <w:pPr>
+        <w:pStyle w:val="Compact"/>
+        <w:numPr>
+          <w:ilvl w:val="0"/>
+          <w:numId w:val="1006"/>
         </w:numPr>
       </w:pPr>
       <w:r>
@@ -3832,6 +3922,38 @@
           <w:b/>
           <w:bCs/>
         </w:rPr>
+        <w:t xml:space="preserve">Say, as I switch to the Mac:</w:t>
+      </w:r>
+    </w:p>
+    <w:p>
+      <w:pPr>
+        <w:pStyle w:val="BlockText"/>
+      </w:pPr>
+      <w:r>
+        <w:t xml:space="preserve">"That's the problem. Now the pipeline. This first command scans a copy of the Terraform that I</w:t>
+      </w:r>
+      <w:r>
+        <w:t xml:space="preserve"> </w:t>
+      </w:r>
+      <w:r>
+        <w:t xml:space="preserve">have deliberately broken - public bucket, open SSH, unencrypted database - and it checks it three</w:t>
+      </w:r>
+      <w:r>
+        <w:t xml:space="preserve"> </w:t>
+      </w:r>
+      <w:r>
+        <w:t xml:space="preserve">times, once for each environment. Watch the numbers."</w:t>
+      </w:r>
+    </w:p>
+    <w:p>
+      <w:pPr>
+        <w:pStyle w:val="FirstParagraph"/>
+      </w:pPr>
+      <w:r>
+        <w:rPr>
+          <w:b/>
+          <w:bCs/>
+        </w:rPr>
         <w:t xml:space="preserve">Switch to the MAC window.</w:t>
       </w:r>
     </w:p>
@@ -3996,6 +4118,38 @@
           <w:b/>
           <w:bCs/>
         </w:rPr>
+        <w:t xml:space="preserve">Say, as I open the browser:</w:t>
+      </w:r>
+    </w:p>
+    <w:p>
+      <w:pPr>
+        <w:pStyle w:val="BlockText"/>
+      </w:pPr>
+      <w:r>
+        <w:t xml:space="preserve">"Now the real change, the one this whole session is about. Production is running out of room</w:t>
+      </w:r>
+      <w:r>
+        <w:t xml:space="preserve"> </w:t>
+      </w:r>
+      <w:r>
+        <w:t xml:space="preserve">during month-end close. This pull request is one number: production goes from two servers to</w:t>
+      </w:r>
+      <w:r>
+        <w:t xml:space="preserve"> </w:t>
+      </w:r>
+      <w:r>
+        <w:t xml:space="preserve">three. What I want you to watch is everything that stands between that number and production."</w:t>
+      </w:r>
+    </w:p>
+    <w:p>
+      <w:pPr>
+        <w:pStyle w:val="FirstParagraph"/>
+      </w:pPr>
+      <w:r>
+        <w:rPr>
+          <w:b/>
+          <w:bCs/>
+        </w:rPr>
         <w:t xml:space="preserve">Switch to the BROWSER, PR #4.</w:t>
       </w:r>
     </w:p>
@@ -4158,6 +4312,38 @@
           <w:b/>
           <w:bCs/>
         </w:rPr>
+        <w:t xml:space="preserve">Say, before I press enter:</w:t>
+      </w:r>
+    </w:p>
+    <w:p>
+      <w:pPr>
+        <w:pStyle w:val="BlockText"/>
+      </w:pPr>
+      <w:r>
+        <w:t xml:space="preserve">"Merging is what authorises a deployment. Nothing deploys before this. I'm the only account on this</w:t>
+      </w:r>
+      <w:r>
+        <w:t xml:space="preserve"> </w:t>
+      </w:r>
+      <w:r>
+        <w:t xml:space="preserve">repository, so I'm going to merge with an administrator override, and GitHub records that I did. In</w:t>
+      </w:r>
+      <w:r>
+        <w:t xml:space="preserve"> </w:t>
+      </w:r>
+      <w:r>
+        <w:t xml:space="preserve">a team, a second engineer clicks here instead of me."</w:t>
+      </w:r>
+    </w:p>
+    <w:p>
+      <w:pPr>
+        <w:pStyle w:val="FirstParagraph"/>
+      </w:pPr>
+      <w:r>
+        <w:rPr>
+          <w:b/>
+          <w:bCs/>
+        </w:rPr>
         <w:t xml:space="preserve">Switch to the SERVER window.</w:t>
       </w:r>
     </w:p>
@@ -4239,6 +4425,38 @@
       </w:pPr>
       <w:r>
         <w:t xml:space="preserve">STEP 7 - Watch it build (6 min)</w:t>
+      </w:r>
+    </w:p>
+    <w:p>
+      <w:pPr>
+        <w:pStyle w:val="FirstParagraph"/>
+      </w:pPr>
+      <w:r>
+        <w:rPr>
+          <w:b/>
+          <w:bCs/>
+        </w:rPr>
+        <w:t xml:space="preserve">Say, as the run appears:</w:t>
+      </w:r>
+    </w:p>
+    <w:p>
+      <w:pPr>
+        <w:pStyle w:val="BlockText"/>
+      </w:pPr>
+      <w:r>
+        <w:t xml:space="preserve">"Now watch it build. The checks run again on main first - secrets alone, then the infrastructure</w:t>
+      </w:r>
+      <w:r>
+        <w:t xml:space="preserve"> </w:t>
+      </w:r>
+      <w:r>
+        <w:t xml:space="preserve">scan three times. Then deploy: development on its own, staging and production each asking for a</w:t>
+      </w:r>
+      <w:r>
+        <w:t xml:space="preserve"> </w:t>
+      </w:r>
+      <w:r>
+        <w:t xml:space="preserve">person. Remember, right now there are zero application servers. By the end of this you'll see five."</w:t>
       </w:r>
     </w:p>
     <w:p>
@@ -5341,6 +5559,38 @@
           <w:b/>
           <w:bCs/>
         </w:rPr>
+        <w:t xml:space="preserve">Say, as I switch to the server:</w:t>
+      </w:r>
+    </w:p>
+    <w:p>
+      <w:pPr>
+        <w:pStyle w:val="BlockText"/>
+      </w:pPr>
+      <w:r>
+        <w:t xml:space="preserve">"Five machines that did not exist ten minutes ago. Terraform built them and never logged into</w:t>
+      </w:r>
+      <w:r>
+        <w:t xml:space="preserve"> </w:t>
+      </w:r>
+      <w:r>
+        <w:t xml:space="preserve">them - it talks to the Proxmox API and stops. Installing the application is a separate step, and I</w:t>
+      </w:r>
+      <w:r>
+        <w:t xml:space="preserve"> </w:t>
+      </w:r>
+      <w:r>
+        <w:t xml:space="preserve">keep it separate on purpose. Watch what it does the second time I run it."</w:t>
+      </w:r>
+    </w:p>
+    <w:p>
+      <w:pPr>
+        <w:pStyle w:val="FirstParagraph"/>
+      </w:pPr>
+      <w:r>
+        <w:rPr>
+          <w:b/>
+          <w:bCs/>
+        </w:rPr>
         <w:t xml:space="preserve">Switch to the SERVER window.</w:t>
       </w:r>
     </w:p>
@@ -5648,7 +5898,7 @@
         <w:pStyle w:val="Compact"/>
         <w:numPr>
           <w:ilvl w:val="0"/>
-          <w:numId w:val="1006"/>
+          <w:numId w:val="1007"/>
         </w:numPr>
       </w:pPr>
       <w:r>
@@ -5682,7 +5932,7 @@
         <w:pStyle w:val="Compact"/>
         <w:numPr>
           <w:ilvl w:val="0"/>
-          <w:numId w:val="1006"/>
+          <w:numId w:val="1007"/>
         </w:numPr>
       </w:pPr>
       <w:r>
@@ -5704,7 +5954,7 @@
         <w:pStyle w:val="Compact"/>
         <w:numPr>
           <w:ilvl w:val="0"/>
-          <w:numId w:val="1006"/>
+          <w:numId w:val="1007"/>
         </w:numPr>
       </w:pPr>
       <w:r>
@@ -5738,7 +5988,7 @@
         <w:pStyle w:val="Compact"/>
         <w:numPr>
           <w:ilvl w:val="0"/>
-          <w:numId w:val="1006"/>
+          <w:numId w:val="1007"/>
         </w:numPr>
       </w:pPr>
       <w:r>
@@ -5766,7 +6016,7 @@
         <w:pStyle w:val="Compact"/>
         <w:numPr>
           <w:ilvl w:val="0"/>
-          <w:numId w:val="1006"/>
+          <w:numId w:val="1007"/>
         </w:numPr>
       </w:pPr>
       <w:r>
@@ -5828,7 +6078,7 @@
         <w:pStyle w:val="Compact"/>
         <w:numPr>
           <w:ilvl w:val="0"/>
-          <w:numId w:val="1006"/>
+          <w:numId w:val="1007"/>
         </w:numPr>
       </w:pPr>
       <w:r>
@@ -5865,7 +6115,7 @@
         <w:pStyle w:val="Compact"/>
         <w:numPr>
           <w:ilvl w:val="0"/>
-          <w:numId w:val="1006"/>
+          <w:numId w:val="1007"/>
         </w:numPr>
       </w:pPr>
       <w:r>
@@ -6333,6 +6583,26 @@
       </w:pPr>
       <w:r>
         <w:t xml:space="preserve">STEP 9 - Close (2 min)</w:t>
+      </w:r>
+    </w:p>
+    <w:p>
+      <w:pPr>
+        <w:pStyle w:val="FirstParagraph"/>
+      </w:pPr>
+      <w:r>
+        <w:rPr>
+          <w:b/>
+          <w:bCs/>
+        </w:rPr>
+        <w:t xml:space="preserve">Say, as I stop sharing:</w:t>
+      </w:r>
+    </w:p>
+    <w:p>
+      <w:pPr>
+        <w:pStyle w:val="BlockText"/>
+      </w:pPr>
+      <w:r>
+        <w:t xml:space="preserve">"Let me stop sharing. Three things I'd like you to take away, and then I'm yours."</w:t>
       </w:r>
     </w:p>
     <w:p>
@@ -13586,7 +13856,7 @@
         <w:pStyle w:val="Compact"/>
         <w:numPr>
           <w:ilvl w:val="0"/>
-          <w:numId w:val="1007"/>
+          <w:numId w:val="1008"/>
         </w:numPr>
       </w:pPr>
       <w:r>
@@ -13598,7 +13868,7 @@
         <w:pStyle w:val="Compact"/>
         <w:numPr>
           <w:ilvl w:val="0"/>
-          <w:numId w:val="1007"/>
+          <w:numId w:val="1008"/>
         </w:numPr>
       </w:pPr>
       <w:r>
@@ -13631,7 +13901,7 @@
         <w:pStyle w:val="Compact"/>
         <w:numPr>
           <w:ilvl w:val="0"/>
-          <w:numId w:val="1007"/>
+          <w:numId w:val="1008"/>
         </w:numPr>
       </w:pPr>
       <w:r>
@@ -13966,6 +14236,9 @@
     <w:abstractNumId w:val="991"/>
   </w:num>
   <w:num w:numId="1006">
+    <w:abstractNumId w:val="991"/>
+  </w:num>
+  <w:num w:numId="1007">
     <w:abstractNumId w:val="99411"/>
     <w:lvlOverride w:ilvl="0">
       <w:startOverride w:val="1"/>
@@ -13995,7 +14268,7 @@
       <w:startOverride w:val="1"/>
     </w:lvlOverride>
   </w:num>
-  <w:num w:numId="1007">
+  <w:num w:numId="1008">
     <w:abstractNumId w:val="99411"/>
     <w:lvlOverride w:ilvl="0">
       <w:startOverride w:val="1"/>

</xml_diff>

<commit_message>
Highlight every spoken line in the runbook Word export in yellow
Co-Authored-By: Claude Fable 5.1 <noreply@anthropic.com>
</commit_message>
<xml_diff>
--- a/docs/word/1-RUNBOOK.docx
+++ b/docs/word/1-RUNBOOK.docx
@@ -800,36 +800,59 @@
         <w:pStyle w:val="BlockText"/>
       </w:pPr>
       <w:r>
+        <w:rPr>
+          <w:highlight w:val="yellow"/>
+        </w:rPr>
         <w:t xml:space="preserve">Postgres only binds</w:t>
       </w:r>
       <w:r>
-        <w:t xml:space="preserve"> </w:t>
-      </w:r>
-      <w:r>
-        <w:rPr>
-          <w:rStyle w:val="VerbatimChar"/>
+        <w:rPr>
+          <w:highlight w:val="yellow"/>
+        </w:rPr>
+        <w:t xml:space="preserve"> </w:t>
+      </w:r>
+      <w:r>
+        <w:rPr>
+          <w:rStyle w:val="VerbatimChar"/>
+          <w:highlight w:val="yellow"/>
         </w:rPr>
         <w:t xml:space="preserve">10.40.10.10</w:t>
       </w:r>
       <w:r>
-        <w:t xml:space="preserve"> </w:t>
-      </w:r>
-      <w:r>
+        <w:rPr>
+          <w:highlight w:val="yellow"/>
+        </w:rPr>
+        <w:t xml:space="preserve"> </w:t>
+      </w:r>
+      <w:r>
+        <w:rPr>
+          <w:highlight w:val="yellow"/>
+        </w:rPr>
         <w:t xml:space="preserve">if that interface is already up when it starts. After a tf-state</w:t>
       </w:r>
       <w:r>
-        <w:t xml:space="preserve"> </w:t>
-      </w:r>
-      <w:r>
+        <w:rPr>
+          <w:highlight w:val="yellow"/>
+        </w:rPr>
+        <w:t xml:space="preserve"> </w:t>
+      </w:r>
+      <w:r>
+        <w:rPr>
+          <w:highlight w:val="yellow"/>
+        </w:rPr>
         <w:t xml:space="preserve">reboot it can come back on loopback alone, and then</w:t>
       </w:r>
       <w:r>
-        <w:t xml:space="preserve"> </w:t>
-      </w:r>
-      <w:r>
-        <w:rPr>
-          <w:b/>
-          <w:bCs/>
+        <w:rPr>
+          <w:highlight w:val="yellow"/>
+        </w:rPr>
+        <w:t xml:space="preserve"> </w:t>
+      </w:r>
+      <w:r>
+        <w:rPr>
+          <w:b/>
+          <w:bCs/>
+          <w:highlight w:val="yellow"/>
         </w:rPr>
         <w:t xml:space="preserve">every</w:t>
       </w:r>
@@ -837,14 +860,16 @@
         <w:rPr>
           <w:b/>
           <w:bCs/>
-        </w:rPr>
-        <w:t xml:space="preserve"> </w:t>
-      </w:r>
-      <w:r>
-        <w:rPr>
-          <w:rStyle w:val="VerbatimChar"/>
-          <w:b/>
-          <w:bCs/>
+          <w:highlight w:val="yellow"/>
+        </w:rPr>
+        <w:t xml:space="preserve"> </w:t>
+      </w:r>
+      <w:r>
+        <w:rPr>
+          <w:rStyle w:val="VerbatimChar"/>
+          <w:b/>
+          <w:bCs/>
+          <w:highlight w:val="yellow"/>
         </w:rPr>
         <w:t xml:space="preserve">terraform init</w:t>
       </w:r>
@@ -852,32 +877,47 @@
         <w:rPr>
           <w:b/>
           <w:bCs/>
-        </w:rPr>
-        <w:t xml:space="preserve"> </w:t>
-      </w:r>
-      <w:r>
-        <w:rPr>
-          <w:b/>
-          <w:bCs/>
+          <w:highlight w:val="yellow"/>
+        </w:rPr>
+        <w:t xml:space="preserve"> </w:t>
+      </w:r>
+      <w:r>
+        <w:rPr>
+          <w:b/>
+          <w:bCs/>
+          <w:highlight w:val="yellow"/>
         </w:rPr>
         <w:t xml:space="preserve">in the demo fails</w:t>
       </w:r>
       <w:r>
-        <w:t xml:space="preserve"> </w:t>
-      </w:r>
-      <w:r>
+        <w:rPr>
+          <w:highlight w:val="yellow"/>
+        </w:rPr>
+        <w:t xml:space="preserve"> </w:t>
+      </w:r>
+      <w:r>
+        <w:rPr>
+          <w:highlight w:val="yellow"/>
+        </w:rPr>
         <w:t xml:space="preserve">with</w:t>
       </w:r>
       <w:r>
-        <w:t xml:space="preserve"> </w:t>
-      </w:r>
-      <w:r>
-        <w:rPr>
-          <w:rStyle w:val="VerbatimChar"/>
+        <w:rPr>
+          <w:highlight w:val="yellow"/>
+        </w:rPr>
+        <w:t xml:space="preserve"> </w:t>
+      </w:r>
+      <w:r>
+        <w:rPr>
+          <w:rStyle w:val="VerbatimChar"/>
+          <w:highlight w:val="yellow"/>
         </w:rPr>
         <w:t xml:space="preserve">connection refused</w:t>
       </w:r>
       <w:r>
+        <w:rPr>
+          <w:highlight w:val="yellow"/>
+        </w:rPr>
         <w:t xml:space="preserve">. This is the single most likely thing to kill the demo. Check it first.</w:t>
       </w:r>
     </w:p>
@@ -2109,6 +2149,7 @@
         <w:rPr>
           <w:b/>
           <w:bCs/>
+          <w:highlight w:val="yellow"/>
         </w:rPr>
         <w:t xml:space="preserve">"Hello everyone, nice to meet you all. I'm George Park.</w:t>
       </w:r>
@@ -2121,6 +2162,7 @@
         <w:rPr>
           <w:b/>
           <w:bCs/>
+          <w:highlight w:val="yellow"/>
         </w:rPr>
         <w:t xml:space="preserve">Today I am going to show you a problem I found by accident, and the pipeline I built to stop it.</w:t>
       </w:r>
@@ -2133,6 +2175,7 @@
         <w:rPr>
           <w:b/>
           <w:bCs/>
+          <w:highlight w:val="yellow"/>
         </w:rPr>
         <w:t xml:space="preserve">Before I get into it, a short word about who I am."</w:t>
       </w:r>
@@ -2310,41 +2353,70 @@
         <w:rPr>
           <w:b/>
           <w:bCs/>
+          <w:highlight w:val="yellow"/>
         </w:rPr>
         <w:t xml:space="preserve">Note to me — the callback.</w:t>
       </w:r>
       <w:r>
-        <w:t xml:space="preserve"> </w:t>
-      </w:r>
-      <w:r>
+        <w:rPr>
+          <w:highlight w:val="yellow"/>
+        </w:rPr>
+        <w:t xml:space="preserve"> </w:t>
+      </w:r>
+      <w:r>
+        <w:rPr>
+          <w:highlight w:val="yellow"/>
+        </w:rPr>
         <w:t xml:space="preserve">The application on every container answers</w:t>
       </w:r>
       <w:r>
+        <w:rPr>
+          <w:highlight w:val="yellow"/>
+        </w:rPr>
         <w:t xml:space="preserve"> </w:t>
       </w:r>
       <w:r>
         <w:rPr>
           <w:i/>
           <w:iCs/>
+          <w:highlight w:val="yellow"/>
         </w:rPr>
         <w:t xml:space="preserve">"Hello World, Hello Guys This is George and nice to meet you."</w:t>
       </w:r>
       <w:r>
-        <w:t xml:space="preserve"> </w:t>
-      </w:r>
-      <w:r>
+        <w:rPr>
+          <w:highlight w:val="yellow"/>
+        </w:rPr>
+        <w:t xml:space="preserve"> </w:t>
+      </w:r>
+      <w:r>
+        <w:rPr>
+          <w:highlight w:val="yellow"/>
+        </w:rPr>
         <w:t xml:space="preserve">That is the same greeting I open</w:t>
       </w:r>
       <w:r>
-        <w:t xml:space="preserve"> </w:t>
-      </w:r>
-      <w:r>
+        <w:rPr>
+          <w:highlight w:val="yellow"/>
+        </w:rPr>
+        <w:t xml:space="preserve"> </w:t>
+      </w:r>
+      <w:r>
+        <w:rPr>
+          <w:highlight w:val="yellow"/>
+        </w:rPr>
         <w:t xml:space="preserve">with. At STEP 8 the machine says it back to the room. Do not point at it or explain the joke. If</w:t>
       </w:r>
       <w:r>
-        <w:t xml:space="preserve"> </w:t>
-      </w:r>
-      <w:r>
+        <w:rPr>
+          <w:highlight w:val="yellow"/>
+        </w:rPr>
+        <w:t xml:space="preserve"> </w:t>
+      </w:r>
+      <w:r>
+        <w:rPr>
+          <w:highlight w:val="yellow"/>
+        </w:rPr>
         <w:t xml:space="preserve">somebody notices, that is the moment. If nobody does, nothing is lost.</w:t>
       </w:r>
     </w:p>
@@ -2363,18 +2435,33 @@
         <w:pStyle w:val="BlockText"/>
       </w:pPr>
       <w:r>
+        <w:rPr>
+          <w:highlight w:val="yellow"/>
+        </w:rPr>
         <w:t xml:space="preserve">"It is a senior DevSecOps role at a company where security is not a side quest. Workers comp means</w:t>
       </w:r>
       <w:r>
-        <w:t xml:space="preserve"> </w:t>
-      </w:r>
-      <w:r>
+        <w:rPr>
+          <w:highlight w:val="yellow"/>
+        </w:rPr>
+        <w:t xml:space="preserve"> </w:t>
+      </w:r>
+      <w:r>
+        <w:rPr>
+          <w:highlight w:val="yellow"/>
+        </w:rPr>
         <w:t xml:space="preserve">regulated data, real audit requirements, and a real cost when it goes wrong. I would rather build</w:t>
       </w:r>
       <w:r>
-        <w:t xml:space="preserve"> </w:t>
-      </w:r>
-      <w:r>
+        <w:rPr>
+          <w:highlight w:val="yellow"/>
+        </w:rPr>
+        <w:t xml:space="preserve"> </w:t>
+      </w:r>
+      <w:r>
+        <w:rPr>
+          <w:highlight w:val="yellow"/>
+        </w:rPr>
         <w:t xml:space="preserve">guardrails somewhere the guardrails matter."</w:t>
       </w:r>
     </w:p>
@@ -2393,18 +2480,33 @@
         <w:pStyle w:val="BlockText"/>
       </w:pPr>
       <w:r>
+        <w:rPr>
+          <w:highlight w:val="yellow"/>
+        </w:rPr>
         <w:t xml:space="preserve">"I write things down. Runbooks, incident notes, decision records. Partly so the next person does not</w:t>
       </w:r>
       <w:r>
-        <w:t xml:space="preserve"> </w:t>
-      </w:r>
-      <w:r>
+        <w:rPr>
+          <w:highlight w:val="yellow"/>
+        </w:rPr>
+        <w:t xml:space="preserve"> </w:t>
+      </w:r>
+      <w:r>
+        <w:rPr>
+          <w:highlight w:val="yellow"/>
+        </w:rPr>
         <w:t xml:space="preserve">have to reconstruct it, and partly because writing it down is how I find out whether I actually</w:t>
       </w:r>
       <w:r>
-        <w:t xml:space="preserve"> </w:t>
-      </w:r>
-      <w:r>
+        <w:rPr>
+          <w:highlight w:val="yellow"/>
+        </w:rPr>
+        <w:t xml:space="preserve"> </w:t>
+      </w:r>
+      <w:r>
+        <w:rPr>
+          <w:highlight w:val="yellow"/>
+        </w:rPr>
         <w:t xml:space="preserve">understand it."</w:t>
       </w:r>
     </w:p>
@@ -2941,12 +3043,21 @@
         <w:pStyle w:val="BlockText"/>
       </w:pPr>
       <w:r>
+        <w:rPr>
+          <w:highlight w:val="yellow"/>
+        </w:rPr>
         <w:t xml:space="preserve">"Right now there are zero application servers. By the end of this you will have watched the</w:t>
       </w:r>
       <w:r>
-        <w:t xml:space="preserve"> </w:t>
-      </w:r>
-      <w:r>
+        <w:rPr>
+          <w:highlight w:val="yellow"/>
+        </w:rPr>
+        <w:t xml:space="preserve"> </w:t>
+      </w:r>
+      <w:r>
+        <w:rPr>
+          <w:highlight w:val="yellow"/>
+        </w:rPr>
         <w:t xml:space="preserve">pipeline build five, and production will be three of them because the file says three."</w:t>
       </w:r>
     </w:p>
@@ -3427,12 +3538,21 @@
         <w:pStyle w:val="BlockText"/>
       </w:pPr>
       <w:r>
+        <w:rPr>
+          <w:highlight w:val="yellow"/>
+        </w:rPr>
         <w:t xml:space="preserve">"Before I show you anything, I want to tell you how this started. It's a story about one</w:t>
       </w:r>
       <w:r>
-        <w:t xml:space="preserve"> </w:t>
-      </w:r>
-      <w:r>
+        <w:rPr>
+          <w:highlight w:val="yellow"/>
+        </w:rPr>
+        <w:t xml:space="preserve"> </w:t>
+      </w:r>
+      <w:r>
+        <w:rPr>
+          <w:highlight w:val="yellow"/>
+        </w:rPr>
         <w:t xml:space="preserve">repository, and it's the reason everything you'll see today exists. I'll keep it short."</w:t>
       </w:r>
     </w:p>
@@ -3569,19 +3689,32 @@
         <w:rPr>
           <w:b/>
           <w:bCs/>
+          <w:highlight w:val="yellow"/>
         </w:rPr>
         <w:t xml:space="preserve">SAY:</w:t>
       </w:r>
       <w:r>
-        <w:t xml:space="preserve"> </w:t>
-      </w:r>
-      <w:r>
+        <w:rPr>
+          <w:highlight w:val="yellow"/>
+        </w:rPr>
+        <w:t xml:space="preserve"> </w:t>
+      </w:r>
+      <w:r>
+        <w:rPr>
+          <w:highlight w:val="yellow"/>
+        </w:rPr>
         <w:t xml:space="preserve">"When something is wrong for nine months and nobody catches it, it is almost never carelessness.</w:t>
       </w:r>
       <w:r>
-        <w:t xml:space="preserve"> </w:t>
-      </w:r>
-      <w:r>
+        <w:rPr>
+          <w:highlight w:val="yellow"/>
+        </w:rPr>
+        <w:t xml:space="preserve"> </w:t>
+      </w:r>
+      <w:r>
+        <w:rPr>
+          <w:highlight w:val="yellow"/>
+        </w:rPr>
         <w:t xml:space="preserve">The system made the wrong thing easy."</w:t>
       </w:r>
     </w:p>
@@ -3612,12 +3745,21 @@
         <w:pStyle w:val="BlockText"/>
       </w:pPr>
       <w:r>
+        <w:rPr>
+          <w:highlight w:val="yellow"/>
+        </w:rPr>
         <w:t xml:space="preserve">"The second repository is the more interesting one, because that team noticed. And they did what</w:t>
       </w:r>
       <w:r>
-        <w:t xml:space="preserve"> </w:t>
-      </w:r>
-      <w:r>
+        <w:rPr>
+          <w:highlight w:val="yellow"/>
+        </w:rPr>
+        <w:t xml:space="preserve"> </w:t>
+      </w:r>
+      <w:r>
+        <w:rPr>
+          <w:highlight w:val="yellow"/>
+        </w:rPr>
         <w:t xml:space="preserve">every team does when they notice."</w:t>
       </w:r>
     </w:p>
@@ -3717,13 +3859,20 @@
         <w:rPr>
           <w:b/>
           <w:bCs/>
+          <w:highlight w:val="yellow"/>
         </w:rPr>
         <w:t xml:space="preserve">SAY:</w:t>
       </w:r>
       <w:r>
-        <w:t xml:space="preserve"> </w:t>
-      </w:r>
-      <w:r>
+        <w:rPr>
+          <w:highlight w:val="yellow"/>
+        </w:rPr>
+        <w:t xml:space="preserve"> </w:t>
+      </w:r>
+      <w:r>
+        <w:rPr>
+          <w:highlight w:val="yellow"/>
+        </w:rPr>
         <w:t xml:space="preserve">"Let me show you what that achieved."</w:t>
       </w:r>
     </w:p>
@@ -3754,12 +3903,21 @@
         <w:pStyle w:val="BlockText"/>
       </w:pPr>
       <w:r>
+        <w:rPr>
+          <w:highlight w:val="yellow"/>
+        </w:rPr>
         <w:t xml:space="preserve">"Let me show you what that fix actually achieved. This is a throwaway repository on my server. It</w:t>
       </w:r>
       <w:r>
-        <w:t xml:space="preserve"> </w:t>
-      </w:r>
-      <w:r>
+        <w:rPr>
+          <w:highlight w:val="yellow"/>
+        </w:rPr>
+        <w:t xml:space="preserve"> </w:t>
+      </w:r>
+      <w:r>
+        <w:rPr>
+          <w:highlight w:val="yellow"/>
+        </w:rPr>
         <w:t xml:space="preserve">is going to commit a password, delete it, ignore it, encrypt it - the three fixes that team applied</w:t>
       </w:r>
     </w:p>
@@ -3967,13 +4125,20 @@
         <w:rPr>
           <w:b/>
           <w:bCs/>
+          <w:highlight w:val="yellow"/>
         </w:rPr>
         <w:t xml:space="preserve">SAY:</w:t>
       </w:r>
       <w:r>
-        <w:t xml:space="preserve"> </w:t>
-      </w:r>
-      <w:r>
+        <w:rPr>
+          <w:highlight w:val="yellow"/>
+        </w:rPr>
+        <w:t xml:space="preserve"> </w:t>
+      </w:r>
+      <w:r>
+        <w:rPr>
+          <w:highlight w:val="yellow"/>
+        </w:rPr>
         <w:t xml:space="preserve">"Every password still there. One command. No special access."</w:t>
       </w:r>
     </w:p>
@@ -3985,19 +4150,32 @@
         <w:rPr>
           <w:b/>
           <w:bCs/>
+          <w:highlight w:val="yellow"/>
         </w:rPr>
         <w:t xml:space="preserve">SAY:</w:t>
       </w:r>
       <w:r>
-        <w:t xml:space="preserve"> </w:t>
-      </w:r>
-      <w:r>
+        <w:rPr>
+          <w:highlight w:val="yellow"/>
+        </w:rPr>
+        <w:t xml:space="preserve"> </w:t>
+      </w:r>
+      <w:r>
+        <w:rPr>
+          <w:highlight w:val="yellow"/>
+        </w:rPr>
         <w:t xml:space="preserve">"Git keeps every version of every file. Deleting removes the pointer, not the file. And it travels</w:t>
       </w:r>
       <w:r>
-        <w:t xml:space="preserve"> </w:t>
-      </w:r>
-      <w:r>
+        <w:rPr>
+          <w:highlight w:val="yellow"/>
+        </w:rPr>
+        <w:t xml:space="preserve"> </w:t>
+      </w:r>
+      <w:r>
+        <w:rPr>
+          <w:highlight w:val="yellow"/>
+        </w:rPr>
         <w:t xml:space="preserve">with every clone."</w:t>
       </w:r>
     </w:p>
@@ -4029,25 +4207,44 @@
         <w:rPr>
           <w:b/>
           <w:bCs/>
+          <w:highlight w:val="yellow"/>
         </w:rPr>
         <w:t xml:space="preserve">SAY:</w:t>
       </w:r>
       <w:r>
-        <w:t xml:space="preserve"> </w:t>
-      </w:r>
-      <w:r>
+        <w:rPr>
+          <w:highlight w:val="yellow"/>
+        </w:rPr>
+        <w:t xml:space="preserve"> </w:t>
+      </w:r>
+      <w:r>
+        <w:rPr>
+          <w:highlight w:val="yellow"/>
+        </w:rPr>
         <w:t xml:space="preserve">"Two things work, and the order matters more than the steps. Change the password first, that takes</w:t>
       </w:r>
       <w:r>
-        <w:t xml:space="preserve"> </w:t>
-      </w:r>
-      <w:r>
+        <w:rPr>
+          <w:highlight w:val="yellow"/>
+        </w:rPr>
+        <w:t xml:space="preserve"> </w:t>
+      </w:r>
+      <w:r>
+        <w:rPr>
+          <w:highlight w:val="yellow"/>
+        </w:rPr>
         <w:t xml:space="preserve">minutes. Rewriting the history takes days, because you have to reach every fork and every laptop.</w:t>
       </w:r>
       <w:r>
-        <w:t xml:space="preserve"> </w:t>
-      </w:r>
-      <w:r>
+        <w:rPr>
+          <w:highlight w:val="yellow"/>
+        </w:rPr>
+        <w:t xml:space="preserve"> </w:t>
+      </w:r>
+      <w:r>
+        <w:rPr>
+          <w:highlight w:val="yellow"/>
+        </w:rPr>
         <w:t xml:space="preserve">Most people do it backwards."</w:t>
       </w:r>
     </w:p>
@@ -4078,18 +4275,33 @@
         <w:pStyle w:val="BlockText"/>
       </w:pPr>
       <w:r>
+        <w:rPr>
+          <w:highlight w:val="yellow"/>
+        </w:rPr>
         <w:t xml:space="preserve">"That's the problem. Now the pipeline. This first command scans a copy of the Terraform that I</w:t>
       </w:r>
       <w:r>
-        <w:t xml:space="preserve"> </w:t>
-      </w:r>
-      <w:r>
+        <w:rPr>
+          <w:highlight w:val="yellow"/>
+        </w:rPr>
+        <w:t xml:space="preserve"> </w:t>
+      </w:r>
+      <w:r>
+        <w:rPr>
+          <w:highlight w:val="yellow"/>
+        </w:rPr>
         <w:t xml:space="preserve">have deliberately broken - public bucket, open SSH, unencrypted database - and it checks it three</w:t>
       </w:r>
       <w:r>
-        <w:t xml:space="preserve"> </w:t>
-      </w:r>
-      <w:r>
+        <w:rPr>
+          <w:highlight w:val="yellow"/>
+        </w:rPr>
+        <w:t xml:space="preserve"> </w:t>
+      </w:r>
+      <w:r>
+        <w:rPr>
+          <w:highlight w:val="yellow"/>
+        </w:rPr>
         <w:t xml:space="preserve">times, once for each environment. Watch the numbers."</w:t>
       </w:r>
     </w:p>
@@ -4167,13 +4379,20 @@
         <w:rPr>
           <w:b/>
           <w:bCs/>
+          <w:highlight w:val="yellow"/>
         </w:rPr>
         <w:t xml:space="preserve">SAY:</w:t>
       </w:r>
       <w:r>
-        <w:t xml:space="preserve"> </w:t>
-      </w:r>
-      <w:r>
+        <w:rPr>
+          <w:highlight w:val="yellow"/>
+        </w:rPr>
+        <w:t xml:space="preserve"> </w:t>
+      </w:r>
+      <w:r>
+        <w:rPr>
+          <w:highlight w:val="yellow"/>
+        </w:rPr>
         <w:t xml:space="preserve">"This is deliberately bad Terraform. Same code, checked three times."</w:t>
       </w:r>
     </w:p>
@@ -4185,19 +4404,32 @@
         <w:rPr>
           <w:b/>
           <w:bCs/>
+          <w:highlight w:val="yellow"/>
         </w:rPr>
         <w:t xml:space="preserve">SAY:</w:t>
       </w:r>
       <w:r>
-        <w:t xml:space="preserve"> </w:t>
-      </w:r>
-      <w:r>
+        <w:rPr>
+          <w:highlight w:val="yellow"/>
+        </w:rPr>
+        <w:t xml:space="preserve"> </w:t>
+      </w:r>
+      <w:r>
+        <w:rPr>
+          <w:highlight w:val="yellow"/>
+        </w:rPr>
         <w:t xml:space="preserve">"Development blocks 10 things. Staging and production block 14. The extra four are things</w:t>
       </w:r>
       <w:r>
-        <w:t xml:space="preserve"> </w:t>
-      </w:r>
-      <w:r>
+        <w:rPr>
+          <w:highlight w:val="yellow"/>
+        </w:rPr>
+        <w:t xml:space="preserve"> </w:t>
+      </w:r>
+      <w:r>
+        <w:rPr>
+          <w:highlight w:val="yellow"/>
+        </w:rPr>
         <w:t xml:space="preserve">development is allowed to skip. Losing a development box costs an afternoon."</w:t>
       </w:r>
     </w:p>
@@ -4261,19 +4493,32 @@
         <w:rPr>
           <w:b/>
           <w:bCs/>
+          <w:highlight w:val="yellow"/>
         </w:rPr>
         <w:t xml:space="preserve">SAY:</w:t>
       </w:r>
       <w:r>
-        <w:t xml:space="preserve"> </w:t>
-      </w:r>
-      <w:r>
+        <w:rPr>
+          <w:highlight w:val="yellow"/>
+        </w:rPr>
+        <w:t xml:space="preserve"> </w:t>
+      </w:r>
+      <w:r>
+        <w:rPr>
+          <w:highlight w:val="yellow"/>
+        </w:rPr>
         <w:t xml:space="preserve">"The scanner finds 24 problems in 110 lines of code. Nobody reads 24 findings, they turn the tool</w:t>
       </w:r>
       <w:r>
-        <w:t xml:space="preserve"> </w:t>
-      </w:r>
-      <w:r>
+        <w:rPr>
+          <w:highlight w:val="yellow"/>
+        </w:rPr>
+        <w:t xml:space="preserve"> </w:t>
+      </w:r>
+      <w:r>
+        <w:rPr>
+          <w:highlight w:val="yellow"/>
+        </w:rPr>
         <w:t xml:space="preserve">off. So 10 stop the merge, 5 are advice, 9 are noted. Choosing which 10 is the actual job."</w:t>
       </w:r>
     </w:p>
@@ -4304,18 +4549,33 @@
         <w:pStyle w:val="BlockText"/>
       </w:pPr>
       <w:r>
+        <w:rPr>
+          <w:highlight w:val="yellow"/>
+        </w:rPr>
         <w:t xml:space="preserve">"Now the real change, the one this whole session is about. Production is running out of room</w:t>
       </w:r>
       <w:r>
-        <w:t xml:space="preserve"> </w:t>
-      </w:r>
-      <w:r>
+        <w:rPr>
+          <w:highlight w:val="yellow"/>
+        </w:rPr>
+        <w:t xml:space="preserve"> </w:t>
+      </w:r>
+      <w:r>
+        <w:rPr>
+          <w:highlight w:val="yellow"/>
+        </w:rPr>
         <w:t xml:space="preserve">during month-end close. This pull request is one number: production goes from two servers to</w:t>
       </w:r>
       <w:r>
-        <w:t xml:space="preserve"> </w:t>
-      </w:r>
-      <w:r>
+        <w:rPr>
+          <w:highlight w:val="yellow"/>
+        </w:rPr>
+        <w:t xml:space="preserve"> </w:t>
+      </w:r>
+      <w:r>
+        <w:rPr>
+          <w:highlight w:val="yellow"/>
+        </w:rPr>
         <w:t xml:space="preserve">three. What I want you to watch is everything that stands between that number and production."</w:t>
       </w:r>
     </w:p>
@@ -4401,19 +4661,32 @@
         <w:rPr>
           <w:b/>
           <w:bCs/>
+          <w:highlight w:val="yellow"/>
         </w:rPr>
         <w:t xml:space="preserve">SAY:</w:t>
       </w:r>
       <w:r>
-        <w:t xml:space="preserve"> </w:t>
-      </w:r>
-      <w:r>
+        <w:rPr>
+          <w:highlight w:val="yellow"/>
+        </w:rPr>
+        <w:t xml:space="preserve"> </w:t>
+      </w:r>
+      <w:r>
+        <w:rPr>
+          <w:highlight w:val="yellow"/>
+        </w:rPr>
         <w:t xml:space="preserve">"Every check passed. Secrets, and the infrastructure scan for all three environments. It is still</w:t>
       </w:r>
       <w:r>
-        <w:t xml:space="preserve"> </w:t>
-      </w:r>
-      <w:r>
+        <w:rPr>
+          <w:highlight w:val="yellow"/>
+        </w:rPr>
+        <w:t xml:space="preserve"> </w:t>
+      </w:r>
+      <w:r>
+        <w:rPr>
+          <w:highlight w:val="yellow"/>
+        </w:rPr>
         <w:t xml:space="preserve">blocked, because the checks are not the only gate."</w:t>
       </w:r>
     </w:p>
@@ -4443,19 +4716,32 @@
         <w:rPr>
           <w:b/>
           <w:bCs/>
+          <w:highlight w:val="yellow"/>
         </w:rPr>
         <w:t xml:space="preserve">SAY:</w:t>
       </w:r>
       <w:r>
-        <w:t xml:space="preserve"> </w:t>
-      </w:r>
-      <w:r>
+        <w:rPr>
+          <w:highlight w:val="yellow"/>
+        </w:rPr>
+        <w:t xml:space="preserve"> </w:t>
+      </w:r>
+      <w:r>
+        <w:rPr>
+          <w:highlight w:val="yellow"/>
+        </w:rPr>
         <w:t xml:space="preserve">"The pipeline wrote these. It sorts the findings and explains them in plain English, so the person</w:t>
       </w:r>
       <w:r>
-        <w:t xml:space="preserve"> </w:t>
-      </w:r>
-      <w:r>
+        <w:rPr>
+          <w:highlight w:val="yellow"/>
+        </w:rPr>
+        <w:t xml:space="preserve"> </w:t>
+      </w:r>
+      <w:r>
+        <w:rPr>
+          <w:highlight w:val="yellow"/>
+        </w:rPr>
         <w:t xml:space="preserve">reviewing does not have to read raw scanner output."</w:t>
       </w:r>
     </w:p>
@@ -4479,25 +4765,44 @@
         <w:rPr>
           <w:b/>
           <w:bCs/>
+          <w:highlight w:val="yellow"/>
         </w:rPr>
         <w:t xml:space="preserve">SAY:</w:t>
       </w:r>
       <w:r>
-        <w:t xml:space="preserve"> </w:t>
-      </w:r>
-      <w:r>
+        <w:rPr>
+          <w:highlight w:val="yellow"/>
+        </w:rPr>
+        <w:t xml:space="preserve"> </w:t>
+      </w:r>
+      <w:r>
+        <w:rPr>
+          <w:highlight w:val="yellow"/>
+        </w:rPr>
         <w:t xml:space="preserve">"I cannot approve this myself. GitHub refuses outright. In a real team a second engineer approves</w:t>
       </w:r>
       <w:r>
-        <w:t xml:space="preserve"> </w:t>
-      </w:r>
-      <w:r>
+        <w:rPr>
+          <w:highlight w:val="yellow"/>
+        </w:rPr>
+        <w:t xml:space="preserve"> </w:t>
+      </w:r>
+      <w:r>
+        <w:rPr>
+          <w:highlight w:val="yellow"/>
+        </w:rPr>
         <w:t xml:space="preserve">here. I am the only account on this repository, so I will merge with an admin override, and GitHub</w:t>
       </w:r>
       <w:r>
-        <w:t xml:space="preserve"> </w:t>
-      </w:r>
-      <w:r>
+        <w:rPr>
+          <w:highlight w:val="yellow"/>
+        </w:rPr>
+        <w:t xml:space="preserve"> </w:t>
+      </w:r>
+      <w:r>
+        <w:rPr>
+          <w:highlight w:val="yellow"/>
+        </w:rPr>
         <w:t xml:space="preserve">records that I did."</w:t>
       </w:r>
     </w:p>
@@ -4528,18 +4833,33 @@
         <w:pStyle w:val="BlockText"/>
       </w:pPr>
       <w:r>
+        <w:rPr>
+          <w:highlight w:val="yellow"/>
+        </w:rPr>
         <w:t xml:space="preserve">"Merging is what authorises a deployment. Nothing deploys before this. I'm the only account on this</w:t>
       </w:r>
       <w:r>
-        <w:t xml:space="preserve"> </w:t>
-      </w:r>
-      <w:r>
+        <w:rPr>
+          <w:highlight w:val="yellow"/>
+        </w:rPr>
+        <w:t xml:space="preserve"> </w:t>
+      </w:r>
+      <w:r>
+        <w:rPr>
+          <w:highlight w:val="yellow"/>
+        </w:rPr>
         <w:t xml:space="preserve">repository, so I'm going to merge with an administrator override, and GitHub records that I did. In</w:t>
       </w:r>
       <w:r>
-        <w:t xml:space="preserve"> </w:t>
-      </w:r>
-      <w:r>
+        <w:rPr>
+          <w:highlight w:val="yellow"/>
+        </w:rPr>
+        <w:t xml:space="preserve"> </w:t>
+      </w:r>
+      <w:r>
+        <w:rPr>
+          <w:highlight w:val="yellow"/>
+        </w:rPr>
         <w:t xml:space="preserve">a team, a second engineer clicks here instead of me."</w:t>
       </w:r>
     </w:p>
@@ -4625,13 +4945,20 @@
         <w:rPr>
           <w:b/>
           <w:bCs/>
+          <w:highlight w:val="yellow"/>
         </w:rPr>
         <w:t xml:space="preserve">SAY:</w:t>
       </w:r>
       <w:r>
-        <w:t xml:space="preserve"> </w:t>
-      </w:r>
-      <w:r>
+        <w:rPr>
+          <w:highlight w:val="yellow"/>
+        </w:rPr>
+        <w:t xml:space="preserve"> </w:t>
+      </w:r>
+      <w:r>
+        <w:rPr>
+          <w:highlight w:val="yellow"/>
+        </w:rPr>
         <w:t xml:space="preserve">"Merging is what authorises a deployment. Nothing deploys before this."</w:t>
       </w:r>
     </w:p>
@@ -4662,18 +4989,33 @@
         <w:pStyle w:val="BlockText"/>
       </w:pPr>
       <w:r>
+        <w:rPr>
+          <w:highlight w:val="yellow"/>
+        </w:rPr>
         <w:t xml:space="preserve">"Now watch it build. The checks run again on main first - secrets alone, then the infrastructure</w:t>
       </w:r>
       <w:r>
-        <w:t xml:space="preserve"> </w:t>
-      </w:r>
-      <w:r>
+        <w:rPr>
+          <w:highlight w:val="yellow"/>
+        </w:rPr>
+        <w:t xml:space="preserve"> </w:t>
+      </w:r>
+      <w:r>
+        <w:rPr>
+          <w:highlight w:val="yellow"/>
+        </w:rPr>
         <w:t xml:space="preserve">scan three times. Then deploy: development on its own, staging and production each asking for a</w:t>
       </w:r>
       <w:r>
-        <w:t xml:space="preserve"> </w:t>
-      </w:r>
-      <w:r>
+        <w:rPr>
+          <w:highlight w:val="yellow"/>
+        </w:rPr>
+        <w:t xml:space="preserve"> </w:t>
+      </w:r>
+      <w:r>
+        <w:rPr>
+          <w:highlight w:val="yellow"/>
+        </w:rPr>
         <w:t xml:space="preserve">person. Remember, right now there are zero application servers. By the end of this you'll see five."</w:t>
       </w:r>
     </w:p>
@@ -4894,19 +5236,32 @@
         <w:rPr>
           <w:b/>
           <w:bCs/>
+          <w:highlight w:val="yellow"/>
         </w:rPr>
         <w:t xml:space="preserve">SAY:</w:t>
       </w:r>
       <w:r>
-        <w:t xml:space="preserve"> </w:t>
-      </w:r>
-      <w:r>
+        <w:rPr>
+          <w:highlight w:val="yellow"/>
+        </w:rPr>
+        <w:t xml:space="preserve"> </w:t>
+      </w:r>
+      <w:r>
+        <w:rPr>
+          <w:highlight w:val="yellow"/>
+        </w:rPr>
         <w:t xml:space="preserve">"Development went out by itself. Staging stopped and is asking for a person. Production is queued</w:t>
       </w:r>
       <w:r>
-        <w:t xml:space="preserve"> </w:t>
-      </w:r>
-      <w:r>
+        <w:rPr>
+          <w:highlight w:val="yellow"/>
+        </w:rPr>
+        <w:t xml:space="preserve"> </w:t>
+      </w:r>
+      <w:r>
+        <w:rPr>
+          <w:highlight w:val="yellow"/>
+        </w:rPr>
         <w:t xml:space="preserve">behind it - it will not even ask until staging is done."</w:t>
       </w:r>
     </w:p>
@@ -5016,19 +5371,32 @@
         <w:rPr>
           <w:b/>
           <w:bCs/>
+          <w:highlight w:val="yellow"/>
         </w:rPr>
         <w:t xml:space="preserve">SAY:</w:t>
       </w:r>
       <w:r>
-        <w:t xml:space="preserve"> </w:t>
-      </w:r>
-      <w:r>
+        <w:rPr>
+          <w:highlight w:val="yellow"/>
+        </w:rPr>
+        <w:t xml:space="preserve"> </w:t>
+      </w:r>
+      <w:r>
+        <w:rPr>
+          <w:highlight w:val="yellow"/>
+        </w:rPr>
         <w:t xml:space="preserve">"Development goes out on its own. Staging and production each need a person to say yes. That is the</w:t>
       </w:r>
       <w:r>
-        <w:t xml:space="preserve"> </w:t>
-      </w:r>
-      <w:r>
+        <w:rPr>
+          <w:highlight w:val="yellow"/>
+        </w:rPr>
+        <w:t xml:space="preserve"> </w:t>
+      </w:r>
+      <w:r>
+        <w:rPr>
+          <w:highlight w:val="yellow"/>
+        </w:rPr>
         <w:t xml:space="preserve">whole promotion model."</w:t>
       </w:r>
     </w:p>
@@ -5058,19 +5426,32 @@
         <w:rPr>
           <w:b/>
           <w:bCs/>
+          <w:highlight w:val="yellow"/>
         </w:rPr>
         <w:t xml:space="preserve">SAY:</w:t>
       </w:r>
       <w:r>
-        <w:t xml:space="preserve"> </w:t>
-      </w:r>
-      <w:r>
+        <w:rPr>
+          <w:highlight w:val="yellow"/>
+        </w:rPr>
+        <w:t xml:space="preserve"> </w:t>
+      </w:r>
+      <w:r>
+        <w:rPr>
+          <w:highlight w:val="yellow"/>
+        </w:rPr>
         <w:t xml:space="preserve">"Production is building three machines because the file now says three. It would have built two</w:t>
       </w:r>
       <w:r>
-        <w:t xml:space="preserve"> </w:t>
-      </w:r>
-      <w:r>
+        <w:rPr>
+          <w:highlight w:val="yellow"/>
+        </w:rPr>
+        <w:t xml:space="preserve"> </w:t>
+      </w:r>
+      <w:r>
+        <w:rPr>
+          <w:highlight w:val="yellow"/>
+        </w:rPr>
         <w:t xml:space="preserve">this morning."</w:t>
       </w:r>
     </w:p>
@@ -5147,19 +5528,32 @@
         <w:rPr>
           <w:b/>
           <w:bCs/>
+          <w:highlight w:val="yellow"/>
         </w:rPr>
         <w:t xml:space="preserve">SAY:</w:t>
       </w:r>
       <w:r>
-        <w:t xml:space="preserve"> </w:t>
-      </w:r>
-      <w:r>
+        <w:rPr>
+          <w:highlight w:val="yellow"/>
+        </w:rPr>
+        <w:t xml:space="preserve"> </w:t>
+      </w:r>
+      <w:r>
+        <w:rPr>
+          <w:highlight w:val="yellow"/>
+        </w:rPr>
         <w:t xml:space="preserve">"Three jobs. Secrets runs first and alone, and nothing else starts until it passes. Then the</w:t>
       </w:r>
       <w:r>
-        <w:t xml:space="preserve"> </w:t>
-      </w:r>
-      <w:r>
+        <w:rPr>
+          <w:highlight w:val="yellow"/>
+        </w:rPr>
+        <w:t xml:space="preserve"> </w:t>
+      </w:r>
+      <w:r>
+        <w:rPr>
+          <w:highlight w:val="yellow"/>
+        </w:rPr>
         <w:t xml:space="preserve">infrastructure scan runs three times in parallel, once per environment. Then deploy, one at a time."</w:t>
       </w:r>
     </w:p>
@@ -5207,19 +5601,32 @@
         <w:rPr>
           <w:b/>
           <w:bCs/>
+          <w:highlight w:val="yellow"/>
         </w:rPr>
         <w:t xml:space="preserve">SAY:</w:t>
       </w:r>
       <w:r>
-        <w:t xml:space="preserve"> </w:t>
-      </w:r>
-      <w:r>
+        <w:rPr>
+          <w:highlight w:val="yellow"/>
+        </w:rPr>
+        <w:t xml:space="preserve"> </w:t>
+      </w:r>
+      <w:r>
+        <w:rPr>
+          <w:highlight w:val="yellow"/>
+        </w:rPr>
         <w:t xml:space="preserve">"That is a container in my house. GitHub scheduled the job; my hardware ran it. The runner connected</w:t>
       </w:r>
       <w:r>
-        <w:t xml:space="preserve"> </w:t>
-      </w:r>
-      <w:r>
+        <w:rPr>
+          <w:highlight w:val="yellow"/>
+        </w:rPr>
+        <w:t xml:space="preserve"> </w:t>
+      </w:r>
+      <w:r>
+        <w:rPr>
+          <w:highlight w:val="yellow"/>
+        </w:rPr>
         <w:t xml:space="preserve">outbound and pulled the work down. There is no inbound firewall rule and no public address."</w:t>
       </w:r>
     </w:p>
@@ -5264,40 +5671,69 @@
         <w:rPr>
           <w:b/>
           <w:bCs/>
+          <w:highlight w:val="yellow"/>
         </w:rPr>
         <w:t xml:space="preserve">SAY:</w:t>
       </w:r>
       <w:r>
-        <w:t xml:space="preserve"> </w:t>
-      </w:r>
-      <w:r>
+        <w:rPr>
+          <w:highlight w:val="yellow"/>
+        </w:rPr>
+        <w:t xml:space="preserve"> </w:t>
+      </w:r>
+      <w:r>
+        <w:rPr>
+          <w:highlight w:val="yellow"/>
+        </w:rPr>
         <w:t xml:space="preserve">"This is gitleaks reading every commit ever made, not just the current files. That is the</w:t>
       </w:r>
       <w:r>
-        <w:t xml:space="preserve"> </w:t>
-      </w:r>
-      <w:r>
-        <w:rPr>
-          <w:rStyle w:val="VerbatimChar"/>
+        <w:rPr>
+          <w:highlight w:val="yellow"/>
+        </w:rPr>
+        <w:t xml:space="preserve"> </w:t>
+      </w:r>
+      <w:r>
+        <w:rPr>
+          <w:rStyle w:val="VerbatimChar"/>
+          <w:highlight w:val="yellow"/>
         </w:rPr>
         <w:t xml:space="preserve">fetch-depth: 0</w:t>
       </w:r>
       <w:r>
-        <w:t xml:space="preserve"> </w:t>
-      </w:r>
-      <w:r>
+        <w:rPr>
+          <w:highlight w:val="yellow"/>
+        </w:rPr>
+        <w:t xml:space="preserve"> </w:t>
+      </w:r>
+      <w:r>
+        <w:rPr>
+          <w:highlight w:val="yellow"/>
+        </w:rPr>
         <w:t xml:space="preserve">line in the workflow. Without it the scan sees one commit, and the password that</w:t>
       </w:r>
       <w:r>
-        <w:t xml:space="preserve"> </w:t>
-      </w:r>
-      <w:r>
+        <w:rPr>
+          <w:highlight w:val="yellow"/>
+        </w:rPr>
+        <w:t xml:space="preserve"> </w:t>
+      </w:r>
+      <w:r>
+        <w:rPr>
+          <w:highlight w:val="yellow"/>
+        </w:rPr>
         <w:t xml:space="preserve">was committed last week and deleted yesterday is invisible. That is the exact case I showed you in</w:t>
       </w:r>
       <w:r>
-        <w:t xml:space="preserve"> </w:t>
-      </w:r>
-      <w:r>
+        <w:rPr>
+          <w:highlight w:val="yellow"/>
+        </w:rPr>
+        <w:t xml:space="preserve"> </w:t>
+      </w:r>
+      <w:r>
+        <w:rPr>
+          <w:highlight w:val="yellow"/>
+        </w:rPr>
         <w:t xml:space="preserve">step 3."</w:t>
       </w:r>
     </w:p>
@@ -5329,13 +5765,20 @@
         <w:rPr>
           <w:b/>
           <w:bCs/>
+          <w:highlight w:val="yellow"/>
         </w:rPr>
         <w:t xml:space="preserve">SAY:</w:t>
       </w:r>
       <w:r>
-        <w:t xml:space="preserve"> </w:t>
-      </w:r>
-      <w:r>
+        <w:rPr>
+          <w:highlight w:val="yellow"/>
+        </w:rPr>
+        <w:t xml:space="preserve"> </w:t>
+      </w:r>
+      <w:r>
+        <w:rPr>
+          <w:highlight w:val="yellow"/>
+        </w:rPr>
         <w:t xml:space="preserve">"That flag is what makes this a gate rather than a report."</w:t>
       </w:r>
     </w:p>
@@ -5406,34 +5849,57 @@
         <w:rPr>
           <w:b/>
           <w:bCs/>
+          <w:highlight w:val="yellow"/>
         </w:rPr>
         <w:t xml:space="preserve">SAY:</w:t>
       </w:r>
       <w:r>
-        <w:t xml:space="preserve"> </w:t>
-      </w:r>
-      <w:r>
+        <w:rPr>
+          <w:highlight w:val="yellow"/>
+        </w:rPr>
+        <w:t xml:space="preserve"> </w:t>
+      </w:r>
+      <w:r>
+        <w:rPr>
+          <w:highlight w:val="yellow"/>
+        </w:rPr>
         <w:t xml:space="preserve">"Checkov just found two dozen things. Notice the job did not fail. It runs with</w:t>
       </w:r>
       <w:r>
-        <w:t xml:space="preserve"> </w:t>
-      </w:r>
-      <w:r>
-        <w:rPr>
-          <w:rStyle w:val="VerbatimChar"/>
+        <w:rPr>
+          <w:highlight w:val="yellow"/>
+        </w:rPr>
+        <w:t xml:space="preserve"> </w:t>
+      </w:r>
+      <w:r>
+        <w:rPr>
+          <w:rStyle w:val="VerbatimChar"/>
+          <w:highlight w:val="yellow"/>
         </w:rPr>
         <w:t xml:space="preserve">--soft-fail</w:t>
       </w:r>
       <w:r>
-        <w:t xml:space="preserve"> </w:t>
-      </w:r>
-      <w:r>
+        <w:rPr>
+          <w:highlight w:val="yellow"/>
+        </w:rPr>
+        <w:t xml:space="preserve"> </w:t>
+      </w:r>
+      <w:r>
+        <w:rPr>
+          <w:highlight w:val="yellow"/>
+        </w:rPr>
         <w:t xml:space="preserve">on</w:t>
       </w:r>
       <w:r>
-        <w:t xml:space="preserve"> </w:t>
-      </w:r>
-      <w:r>
+        <w:rPr>
+          <w:highlight w:val="yellow"/>
+        </w:rPr>
+        <w:t xml:space="preserve"> </w:t>
+      </w:r>
+      <w:r>
+        <w:rPr>
+          <w:highlight w:val="yellow"/>
+        </w:rPr>
         <w:t xml:space="preserve">purpose. Checkov reports; it does not decide."</w:t>
       </w:r>
     </w:p>
@@ -5445,25 +5911,44 @@
         <w:rPr>
           <w:b/>
           <w:bCs/>
+          <w:highlight w:val="yellow"/>
         </w:rPr>
         <w:t xml:space="preserve">SAY:</w:t>
       </w:r>
       <w:r>
-        <w:t xml:space="preserve"> </w:t>
-      </w:r>
-      <w:r>
+        <w:rPr>
+          <w:highlight w:val="yellow"/>
+        </w:rPr>
+        <w:t xml:space="preserve"> </w:t>
+      </w:r>
+      <w:r>
+        <w:rPr>
+          <w:highlight w:val="yellow"/>
+        </w:rPr>
         <w:t xml:space="preserve">"The decision is the next step. That script reads Checkov's JSON and checks it against a list of</w:t>
       </w:r>
       <w:r>
-        <w:t xml:space="preserve"> </w:t>
-      </w:r>
-      <w:r>
+        <w:rPr>
+          <w:highlight w:val="yellow"/>
+        </w:rPr>
+        <w:t xml:space="preserve"> </w:t>
+      </w:r>
+      <w:r>
+        <w:rPr>
+          <w:highlight w:val="yellow"/>
+        </w:rPr>
         <w:t xml:space="preserve">ten policy IDs in development, fourteen in staging and production. The list is in the repository, so</w:t>
       </w:r>
       <w:r>
-        <w:t xml:space="preserve"> </w:t>
-      </w:r>
-      <w:r>
+        <w:rPr>
+          <w:highlight w:val="yellow"/>
+        </w:rPr>
+        <w:t xml:space="preserve"> </w:t>
+      </w:r>
+      <w:r>
+        <w:rPr>
+          <w:highlight w:val="yellow"/>
+        </w:rPr>
         <w:t xml:space="preserve">changing what blocks a merge is itself a reviewed change."</w:t>
       </w:r>
     </w:p>
@@ -5483,25 +5968,44 @@
         <w:rPr>
           <w:b/>
           <w:bCs/>
+          <w:highlight w:val="yellow"/>
         </w:rPr>
         <w:t xml:space="preserve">SAY:</w:t>
       </w:r>
       <w:r>
-        <w:t xml:space="preserve"> </w:t>
-      </w:r>
-      <w:r>
+        <w:rPr>
+          <w:highlight w:val="yellow"/>
+        </w:rPr>
+        <w:t xml:space="preserve"> </w:t>
+      </w:r>
+      <w:r>
+        <w:rPr>
+          <w:highlight w:val="yellow"/>
+        </w:rPr>
         <w:t xml:space="preserve">"The extra four are things development is allowed to skip: deletion protection, Multi-AZ, log</w:t>
       </w:r>
       <w:r>
-        <w:t xml:space="preserve"> </w:t>
-      </w:r>
-      <w:r>
+        <w:rPr>
+          <w:highlight w:val="yellow"/>
+        </w:rPr>
+        <w:t xml:space="preserve"> </w:t>
+      </w:r>
+      <w:r>
+        <w:rPr>
+          <w:highlight w:val="yellow"/>
+        </w:rPr>
         <w:t xml:space="preserve">export, enhanced monitoring. Development is allowed to be cheaper, and the pipeline says so out</w:t>
       </w:r>
       <w:r>
-        <w:t xml:space="preserve"> </w:t>
-      </w:r>
-      <w:r>
+        <w:rPr>
+          <w:highlight w:val="yellow"/>
+        </w:rPr>
+        <w:t xml:space="preserve"> </w:t>
+      </w:r>
+      <w:r>
+        <w:rPr>
+          <w:highlight w:val="yellow"/>
+        </w:rPr>
         <w:t xml:space="preserve">loud instead of pretending every environment is equal."</w:t>
       </w:r>
     </w:p>
@@ -5565,37 +6069,63 @@
         <w:rPr>
           <w:b/>
           <w:bCs/>
+          <w:highlight w:val="yellow"/>
         </w:rPr>
         <w:t xml:space="preserve">SAY:</w:t>
       </w:r>
       <w:r>
-        <w:t xml:space="preserve"> </w:t>
-      </w:r>
-      <w:r>
+        <w:rPr>
+          <w:highlight w:val="yellow"/>
+        </w:rPr>
+        <w:t xml:space="preserve"> </w:t>
+      </w:r>
+      <w:r>
+        <w:rPr>
+          <w:highlight w:val="yellow"/>
+        </w:rPr>
         <w:t xml:space="preserve">"Same code, three copies, three different machines. The production job can only land on the</w:t>
       </w:r>
       <w:r>
-        <w:t xml:space="preserve"> </w:t>
-      </w:r>
-      <w:r>
+        <w:rPr>
+          <w:highlight w:val="yellow"/>
+        </w:rPr>
+        <w:t xml:space="preserve"> </w:t>
+      </w:r>
+      <w:r>
+        <w:rPr>
+          <w:highlight w:val="yellow"/>
+        </w:rPr>
         <w:t xml:space="preserve">production runner, because of one line:</w:t>
       </w:r>
       <w:r>
-        <w:t xml:space="preserve"> </w:t>
-      </w:r>
-      <w:r>
-        <w:rPr>
-          <w:rStyle w:val="VerbatimChar"/>
+        <w:rPr>
+          <w:highlight w:val="yellow"/>
+        </w:rPr>
+        <w:t xml:space="preserve"> </w:t>
+      </w:r>
+      <w:r>
+        <w:rPr>
+          <w:rStyle w:val="VerbatimChar"/>
+          <w:highlight w:val="yellow"/>
         </w:rPr>
         <w:t xml:space="preserve">runs-on: [self-hosted, matrix.environment]</w:t>
       </w:r>
       <w:r>
+        <w:rPr>
+          <w:highlight w:val="yellow"/>
+        </w:rPr>
         <w:t xml:space="preserve">. A pull request</w:t>
       </w:r>
       <w:r>
-        <w:t xml:space="preserve"> </w:t>
-      </w:r>
-      <w:r>
+        <w:rPr>
+          <w:highlight w:val="yellow"/>
+        </w:rPr>
+        <w:t xml:space="preserve"> </w:t>
+      </w:r>
+      <w:r>
+        <w:rPr>
+          <w:highlight w:val="yellow"/>
+        </w:rPr>
         <w:t xml:space="preserve">that touches development never executes on the machine that holds the production key."</w:t>
       </w:r>
     </w:p>
@@ -5837,19 +6367,32 @@
         <w:rPr>
           <w:b/>
           <w:bCs/>
+          <w:highlight w:val="yellow"/>
         </w:rPr>
         <w:t xml:space="preserve">SAY:</w:t>
       </w:r>
       <w:r>
-        <w:t xml:space="preserve"> </w:t>
-      </w:r>
-      <w:r>
+        <w:rPr>
+          <w:highlight w:val="yellow"/>
+        </w:rPr>
+        <w:t xml:space="preserve"> </w:t>
+      </w:r>
+      <w:r>
+        <w:rPr>
+          <w:highlight w:val="yellow"/>
+        </w:rPr>
         <w:t xml:space="preserve">"That is a GitHub Environment with a required reviewer. It is configured in repository settings, not</w:t>
       </w:r>
       <w:r>
-        <w:t xml:space="preserve"> </w:t>
-      </w:r>
-      <w:r>
+        <w:rPr>
+          <w:highlight w:val="yellow"/>
+        </w:rPr>
+        <w:t xml:space="preserve"> </w:t>
+      </w:r>
+      <w:r>
+        <w:rPr>
+          <w:highlight w:val="yellow"/>
+        </w:rPr>
         <w:t xml:space="preserve">in the workflow file, which means a pull request cannot change it."</w:t>
       </w:r>
     </w:p>
@@ -5905,18 +6448,33 @@
         <w:pStyle w:val="BlockText"/>
       </w:pPr>
       <w:r>
+        <w:rPr>
+          <w:highlight w:val="yellow"/>
+        </w:rPr>
         <w:t xml:space="preserve">"Five machines that did not exist ten minutes ago. Terraform built them and never logged into</w:t>
       </w:r>
       <w:r>
-        <w:t xml:space="preserve"> </w:t>
-      </w:r>
-      <w:r>
+        <w:rPr>
+          <w:highlight w:val="yellow"/>
+        </w:rPr>
+        <w:t xml:space="preserve"> </w:t>
+      </w:r>
+      <w:r>
+        <w:rPr>
+          <w:highlight w:val="yellow"/>
+        </w:rPr>
         <w:t xml:space="preserve">them - it talks to the Proxmox API and stops. Installing the application is a separate step, and I</w:t>
       </w:r>
       <w:r>
-        <w:t xml:space="preserve"> </w:t>
-      </w:r>
-      <w:r>
+        <w:rPr>
+          <w:highlight w:val="yellow"/>
+        </w:rPr>
+        <w:t xml:space="preserve"> </w:t>
+      </w:r>
+      <w:r>
+        <w:rPr>
+          <w:highlight w:val="yellow"/>
+        </w:rPr>
         <w:t xml:space="preserve">keep it separate on purpose. Watch what it does the second time I run it."</w:t>
       </w:r>
     </w:p>
@@ -5957,13 +6515,20 @@
         <w:rPr>
           <w:b/>
           <w:bCs/>
+          <w:highlight w:val="yellow"/>
         </w:rPr>
         <w:t xml:space="preserve">SAY:</w:t>
       </w:r>
       <w:r>
-        <w:t xml:space="preserve"> </w:t>
-      </w:r>
-      <w:r>
+        <w:rPr>
+          <w:highlight w:val="yellow"/>
+        </w:rPr>
+        <w:t xml:space="preserve"> </w:t>
+      </w:r>
+      <w:r>
+        <w:rPr>
+          <w:highlight w:val="yellow"/>
+        </w:rPr>
         <w:t xml:space="preserve">"Five machines that did not exist ten minutes ago."</w:t>
       </w:r>
     </w:p>
@@ -5993,25 +6558,44 @@
         <w:rPr>
           <w:b/>
           <w:bCs/>
+          <w:highlight w:val="yellow"/>
         </w:rPr>
         <w:t xml:space="preserve">SAY:</w:t>
       </w:r>
       <w:r>
-        <w:t xml:space="preserve"> </w:t>
-      </w:r>
-      <w:r>
+        <w:rPr>
+          <w:highlight w:val="yellow"/>
+        </w:rPr>
+        <w:t xml:space="preserve"> </w:t>
+      </w:r>
+      <w:r>
+        <w:rPr>
+          <w:highlight w:val="yellow"/>
+        </w:rPr>
         <w:t xml:space="preserve">"Terraform talks to the Proxmox API to build machines. It never logs into them. Installing the</w:t>
       </w:r>
       <w:r>
-        <w:t xml:space="preserve"> </w:t>
-      </w:r>
-      <w:r>
+        <w:rPr>
+          <w:highlight w:val="yellow"/>
+        </w:rPr>
+        <w:t xml:space="preserve"> </w:t>
+      </w:r>
+      <w:r>
+        <w:rPr>
+          <w:highlight w:val="yellow"/>
+        </w:rPr>
         <w:t xml:space="preserve">application is a separate stage, and I keep it separate on purpose, so rebuilding a server does not</w:t>
       </w:r>
       <w:r>
-        <w:t xml:space="preserve"> </w:t>
-      </w:r>
-      <w:r>
+        <w:rPr>
+          <w:highlight w:val="yellow"/>
+        </w:rPr>
+        <w:t xml:space="preserve"> </w:t>
+      </w:r>
+      <w:r>
+        <w:rPr>
+          <w:highlight w:val="yellow"/>
+        </w:rPr>
         <w:t xml:space="preserve">mean redeploying the application, and redeploying does not mean rebuilding."</w:t>
       </w:r>
     </w:p>
@@ -6228,19 +6812,32 @@
         <w:rPr>
           <w:b/>
           <w:bCs/>
+          <w:highlight w:val="yellow"/>
         </w:rPr>
         <w:t xml:space="preserve">SAY:</w:t>
       </w:r>
       <w:r>
-        <w:t xml:space="preserve"> </w:t>
-      </w:r>
-      <w:r>
+        <w:rPr>
+          <w:highlight w:val="yellow"/>
+        </w:rPr>
+        <w:t xml:space="preserve"> </w:t>
+      </w:r>
+      <w:r>
+        <w:rPr>
+          <w:highlight w:val="yellow"/>
+        </w:rPr>
         <w:t xml:space="preserve">"It checks what each one is serving before it touches it. I can run this as many times as I like</w:t>
       </w:r>
       <w:r>
-        <w:t xml:space="preserve"> </w:t>
-      </w:r>
-      <w:r>
+        <w:rPr>
+          <w:highlight w:val="yellow"/>
+        </w:rPr>
+        <w:t xml:space="preserve"> </w:t>
+      </w:r>
+      <w:r>
+        <w:rPr>
+          <w:highlight w:val="yellow"/>
+        </w:rPr>
         <w:t xml:space="preserve">and it only acts where something is actually missing."</w:t>
       </w:r>
     </w:p>
@@ -6872,19 +7469,32 @@
         <w:rPr>
           <w:b/>
           <w:bCs/>
+          <w:highlight w:val="yellow"/>
         </w:rPr>
         <w:t xml:space="preserve">SAY:</w:t>
       </w:r>
       <w:r>
-        <w:t xml:space="preserve"> </w:t>
-      </w:r>
-      <w:r>
+        <w:rPr>
+          <w:highlight w:val="yellow"/>
+        </w:rPr>
+        <w:t xml:space="preserve"> </w:t>
+      </w:r>
+      <w:r>
+        <w:rPr>
+          <w:highlight w:val="yellow"/>
+        </w:rPr>
         <w:t xml:space="preserve">"Five machines. Each one knows which environment it is, because it reads it from its own hostname.</w:t>
       </w:r>
       <w:r>
-        <w:t xml:space="preserve"> </w:t>
-      </w:r>
-      <w:r>
+        <w:rPr>
+          <w:highlight w:val="yellow"/>
+        </w:rPr>
+        <w:t xml:space="preserve"> </w:t>
+      </w:r>
+      <w:r>
+        <w:rPr>
+          <w:highlight w:val="yellow"/>
+        </w:rPr>
         <w:t xml:space="preserve">Three in production, because the file now says three."</w:t>
       </w:r>
     </w:p>
@@ -6980,6 +7590,9 @@
         <w:pStyle w:val="BlockText"/>
       </w:pPr>
       <w:r>
+        <w:rPr>
+          <w:highlight w:val="yellow"/>
+        </w:rPr>
         <w:t xml:space="preserve">"Let me stop sharing. Three things I'd like you to take away, and then I'm yours."</w:t>
       </w:r>
     </w:p>
@@ -7069,13 +7682,20 @@
         <w:rPr>
           <w:b/>
           <w:bCs/>
+          <w:highlight w:val="yellow"/>
         </w:rPr>
         <w:t xml:space="preserve">SAY:</w:t>
       </w:r>
       <w:r>
-        <w:t xml:space="preserve"> </w:t>
-      </w:r>
-      <w:r>
+        <w:rPr>
+          <w:highlight w:val="yellow"/>
+        </w:rPr>
+        <w:t xml:space="preserve"> </w:t>
+      </w:r>
+      <w:r>
+        <w:rPr>
+          <w:highlight w:val="yellow"/>
+        </w:rPr>
         <w:t xml:space="preserve">"Happy to go anywhere you would like with it."</w:t>
       </w:r>
     </w:p>
@@ -7865,6 +8485,9 @@
         <w:pStyle w:val="BlockText"/>
       </w:pPr>
       <w:r>
+        <w:rPr>
+          <w:highlight w:val="yellow"/>
+        </w:rPr>
         <w:t xml:space="preserve">"Happy to go anywhere you would like with it."</w:t>
       </w:r>
     </w:p>
@@ -9258,12 +9881,21 @@
         <w:pStyle w:val="BlockText"/>
       </w:pPr>
       <w:r>
+        <w:rPr>
+          <w:highlight w:val="yellow"/>
+        </w:rPr>
         <w:t xml:space="preserve">"A single boundary is one mistake away from nothing. Three independent ones mean an attacker needs</w:t>
       </w:r>
       <w:r>
-        <w:t xml:space="preserve"> </w:t>
-      </w:r>
-      <w:r>
+        <w:rPr>
+          <w:highlight w:val="yellow"/>
+        </w:rPr>
+        <w:t xml:space="preserve"> </w:t>
+      </w:r>
+      <w:r>
+        <w:rPr>
+          <w:highlight w:val="yellow"/>
+        </w:rPr>
         <w:t xml:space="preserve">three independent mistakes."</w:t>
       </w:r>
     </w:p>
@@ -13327,12 +13959,21 @@
         <w:pStyle w:val="BlockText"/>
       </w:pPr>
       <w:r>
+        <w:rPr>
+          <w:highlight w:val="yellow"/>
+        </w:rPr>
         <w:t xml:space="preserve">"Production refused to be deleted by automation. A human had to disarm it on purpose. That is the</w:t>
       </w:r>
       <w:r>
-        <w:t xml:space="preserve"> </w:t>
-      </w:r>
-      <w:r>
+        <w:rPr>
+          <w:highlight w:val="yellow"/>
+        </w:rPr>
+        <w:t xml:space="preserve"> </w:t>
+      </w:r>
+      <w:r>
+        <w:rPr>
+          <w:highlight w:val="yellow"/>
+        </w:rPr>
         <w:t xml:space="preserve">difference between dev and prod in one error message."</w:t>
       </w:r>
     </w:p>

</xml_diff>

<commit_message>
Highlight all of Part B of the runbook: it is the spoken introduction
Co-Authored-By: Claude Fable 5.1 <noreply@anthropic.com>
</commit_message>
<xml_diff>
--- a/docs/word/1-RUNBOOK.docx
+++ b/docs/word/1-RUNBOOK.docx
@@ -2103,6 +2103,9 @@
         <w:pStyle w:val="FirstParagraph"/>
       </w:pPr>
       <w:r>
+        <w:rPr>
+          <w:highlight w:val="yellow"/>
+        </w:rPr>
         <w:t xml:space="preserve">Sections 1 and 2 spoken. Nothing shared on screen yet.</w:t>
       </w:r>
     </w:p>
@@ -2111,12 +2114,21 @@
         <w:pStyle w:val="BodyText"/>
       </w:pPr>
       <w:r>
+        <w:rPr>
+          <w:highlight w:val="yellow"/>
+        </w:rPr>
         <w:t xml:space="preserve">They asked for a short introduction before the presentation. About ninety seconds, which leaves room</w:t>
       </w:r>
       <w:r>
-        <w:t xml:space="preserve"> </w:t>
-      </w:r>
-      <w:r>
+        <w:rPr>
+          <w:highlight w:val="yellow"/>
+        </w:rPr>
+        <w:t xml:space="preserve"> </w:t>
+      </w:r>
+      <w:r>
+        <w:rPr>
+          <w:highlight w:val="yellow"/>
+        </w:rPr>
         <w:t xml:space="preserve">for them to ask something. Do not read it word for word, but do not improvise it either.</w:t>
       </w:r>
     </w:p>
@@ -2137,6 +2149,7 @@
         <w:rPr>
           <w:b/>
           <w:bCs/>
+          <w:highlight w:val="yellow"/>
         </w:rPr>
         <w:t xml:space="preserve">Open with this. Slow down. Look at them, not at the screen. Nothing is shared yet.</w:t>
       </w:r>
@@ -2185,6 +2198,9 @@
         <w:pStyle w:val="FirstParagraph"/>
       </w:pPr>
       <w:r>
+        <w:rPr>
+          <w:highlight w:val="yellow"/>
+        </w:rPr>
         <w:t xml:space="preserve">Then straight into the ninety seconds.</w:t>
       </w:r>
     </w:p>
@@ -2200,12 +2216,21 @@
         <w:pStyle w:val="FirstParagraph"/>
       </w:pPr>
       <w:r>
+        <w:rPr>
+          <w:highlight w:val="yellow"/>
+        </w:rPr>
         <w:t xml:space="preserve">I work in operations and platform engineering. Day to day that means Kubernetes, Terraform, CI/CD</w:t>
       </w:r>
       <w:r>
-        <w:t xml:space="preserve"> </w:t>
-      </w:r>
-      <w:r>
+        <w:rPr>
+          <w:highlight w:val="yellow"/>
+        </w:rPr>
+        <w:t xml:space="preserve"> </w:t>
+      </w:r>
+      <w:r>
+        <w:rPr>
+          <w:highlight w:val="yellow"/>
+        </w:rPr>
         <w:t xml:space="preserve">pipelines, and monitoring, across AWS and GCP.</w:t>
       </w:r>
     </w:p>
@@ -2214,18 +2239,33 @@
         <w:pStyle w:val="BodyText"/>
       </w:pPr>
       <w:r>
+        <w:rPr>
+          <w:highlight w:val="yellow"/>
+        </w:rPr>
         <w:t xml:space="preserve">Most of my career has been the same job in different shapes: keep the platform running, and make the</w:t>
       </w:r>
       <w:r>
-        <w:t xml:space="preserve"> </w:t>
-      </w:r>
-      <w:r>
+        <w:rPr>
+          <w:highlight w:val="yellow"/>
+        </w:rPr>
+        <w:t xml:space="preserve"> </w:t>
+      </w:r>
+      <w:r>
+        <w:rPr>
+          <w:highlight w:val="yellow"/>
+        </w:rPr>
         <w:t xml:space="preserve">safe path the easy path for the engineers using it. If doing the right thing is slower than doing the</w:t>
       </w:r>
       <w:r>
-        <w:t xml:space="preserve"> </w:t>
-      </w:r>
-      <w:r>
+        <w:rPr>
+          <w:highlight w:val="yellow"/>
+        </w:rPr>
+        <w:t xml:space="preserve"> </w:t>
+      </w:r>
+      <w:r>
+        <w:rPr>
+          <w:highlight w:val="yellow"/>
+        </w:rPr>
         <w:t xml:space="preserve">wrong thing, people will do the wrong thing. That is not a discipline problem, it is a design problem.</w:t>
       </w:r>
     </w:p>
@@ -2234,18 +2274,33 @@
         <w:pStyle w:val="BodyText"/>
       </w:pPr>
       <w:r>
+        <w:rPr>
+          <w:highlight w:val="yellow"/>
+        </w:rPr>
         <w:t xml:space="preserve">Most recently I have been the platform lead on a retail analytics product. Backend services, a data</w:t>
       </w:r>
       <w:r>
-        <w:t xml:space="preserve"> </w:t>
-      </w:r>
-      <w:r>
+        <w:rPr>
+          <w:highlight w:val="yellow"/>
+        </w:rPr>
+        <w:t xml:space="preserve"> </w:t>
+      </w:r>
+      <w:r>
+        <w:rPr>
+          <w:highlight w:val="yellow"/>
+        </w:rPr>
         <w:t xml:space="preserve">warehouse behind them, an LLM service alongside. I owned the clusters, the deployment path, the</w:t>
       </w:r>
       <w:r>
-        <w:t xml:space="preserve"> </w:t>
-      </w:r>
-      <w:r>
+        <w:rPr>
+          <w:highlight w:val="yellow"/>
+        </w:rPr>
+        <w:t xml:space="preserve"> </w:t>
+      </w:r>
+      <w:r>
+        <w:rPr>
+          <w:highlight w:val="yellow"/>
+        </w:rPr>
         <w:t xml:space="preserve">observability, and the incident response.</w:t>
       </w:r>
     </w:p>
@@ -2254,6 +2309,9 @@
         <w:pStyle w:val="BodyText"/>
       </w:pPr>
       <w:r>
+        <w:rPr>
+          <w:highlight w:val="yellow"/>
+        </w:rPr>
         <w:t xml:space="preserve">Two things from that job are why I am sitting here.</w:t>
       </w:r>
     </w:p>
@@ -2262,18 +2320,33 @@
         <w:pStyle w:val="BodyText"/>
       </w:pPr>
       <w:r>
+        <w:rPr>
+          <w:highlight w:val="yellow"/>
+        </w:rPr>
         <w:t xml:space="preserve">The first is that I spent a lot of time on the boundary between security and delivery. Access</w:t>
       </w:r>
       <w:r>
-        <w:t xml:space="preserve"> </w:t>
-      </w:r>
-      <w:r>
+        <w:rPr>
+          <w:highlight w:val="yellow"/>
+        </w:rPr>
+        <w:t xml:space="preserve"> </w:t>
+      </w:r>
+      <w:r>
+        <w:rPr>
+          <w:highlight w:val="yellow"/>
+        </w:rPr>
         <w:t xml:space="preserve">control, secret handling, what gets to block a deployment and what does not. That boundary is where</w:t>
       </w:r>
       <w:r>
-        <w:t xml:space="preserve"> </w:t>
-      </w:r>
-      <w:r>
+        <w:rPr>
+          <w:highlight w:val="yellow"/>
+        </w:rPr>
+        <w:t xml:space="preserve"> </w:t>
+      </w:r>
+      <w:r>
+        <w:rPr>
+          <w:highlight w:val="yellow"/>
+        </w:rPr>
         <w:t xml:space="preserve">most of the friction lives, and it is the part I actually enjoy.</w:t>
       </w:r>
     </w:p>
@@ -2282,18 +2355,33 @@
         <w:pStyle w:val="BodyText"/>
       </w:pPr>
       <w:r>
+        <w:rPr>
+          <w:highlight w:val="yellow"/>
+        </w:rPr>
         <w:t xml:space="preserve">The second is an outage. Our ingress controller was running a single replica. Nobody had decided</w:t>
       </w:r>
       <w:r>
-        <w:t xml:space="preserve"> </w:t>
-      </w:r>
-      <w:r>
+        <w:rPr>
+          <w:highlight w:val="yellow"/>
+        </w:rPr>
+        <w:t xml:space="preserve"> </w:t>
+      </w:r>
+      <w:r>
+        <w:rPr>
+          <w:highlight w:val="yellow"/>
+        </w:rPr>
         <w:t xml:space="preserve">that; it was just the default nobody revisited. When the node under it stalled, the whole environment</w:t>
       </w:r>
       <w:r>
-        <w:t xml:space="preserve"> </w:t>
-      </w:r>
-      <w:r>
+        <w:rPr>
+          <w:highlight w:val="yellow"/>
+        </w:rPr>
+        <w:t xml:space="preserve"> </w:t>
+      </w:r>
+      <w:r>
+        <w:rPr>
+          <w:highlight w:val="yellow"/>
+        </w:rPr>
         <w:t xml:space="preserve">went dark. Everything was green right up until it was not.</w:t>
       </w:r>
     </w:p>
@@ -2302,18 +2390,33 @@
         <w:pStyle w:val="BodyText"/>
       </w:pPr>
       <w:r>
+        <w:rPr>
+          <w:highlight w:val="yellow"/>
+        </w:rPr>
         <w:t xml:space="preserve">That taught me the thing I keep coming back to. The dangerous problems are rarely the ones somebody</w:t>
       </w:r>
       <w:r>
-        <w:t xml:space="preserve"> </w:t>
-      </w:r>
-      <w:r>
+        <w:rPr>
+          <w:highlight w:val="yellow"/>
+        </w:rPr>
+        <w:t xml:space="preserve"> </w:t>
+      </w:r>
+      <w:r>
+        <w:rPr>
+          <w:highlight w:val="yellow"/>
+        </w:rPr>
         <w:t xml:space="preserve">did wrong. They are the ones the system quietly made easy to get wrong, and nobody had a reason to</w:t>
       </w:r>
       <w:r>
-        <w:t xml:space="preserve"> </w:t>
-      </w:r>
-      <w:r>
+        <w:rPr>
+          <w:highlight w:val="yellow"/>
+        </w:rPr>
+        <w:t xml:space="preserve"> </w:t>
+      </w:r>
+      <w:r>
+        <w:rPr>
+          <w:highlight w:val="yellow"/>
+        </w:rPr>
         <w:t xml:space="preserve">look.</w:t>
       </w:r>
     </w:p>
@@ -2322,12 +2425,21 @@
         <w:pStyle w:val="BodyText"/>
       </w:pPr>
       <w:r>
+        <w:rPr>
+          <w:highlight w:val="yellow"/>
+        </w:rPr>
         <w:t xml:space="preserve">Today I want to show you one of those. It is about secrets in git, and I found it by accident during</w:t>
       </w:r>
       <w:r>
-        <w:t xml:space="preserve"> </w:t>
-      </w:r>
-      <w:r>
+        <w:rPr>
+          <w:highlight w:val="yellow"/>
+        </w:rPr>
+        <w:t xml:space="preserve"> </w:t>
+      </w:r>
+      <w:r>
+        <w:rPr>
+          <w:highlight w:val="yellow"/>
+        </w:rPr>
         <w:t xml:space="preserve">routine housekeeping.</w:t>
       </w:r>
     </w:p>
@@ -2336,12 +2448,21 @@
         <w:pStyle w:val="BodyText"/>
       </w:pPr>
       <w:r>
+        <w:rPr>
+          <w:highlight w:val="yellow"/>
+        </w:rPr>
         <w:t xml:space="preserve">I have built a working pipeline to demonstrate it. It runs on hardware in my house, it is running</w:t>
       </w:r>
       <w:r>
-        <w:t xml:space="preserve"> </w:t>
-      </w:r>
-      <w:r>
+        <w:rPr>
+          <w:highlight w:val="yellow"/>
+        </w:rPr>
+        <w:t xml:space="preserve"> </w:t>
+      </w:r>
+      <w:r>
+        <w:rPr>
+          <w:highlight w:val="yellow"/>
+        </w:rPr>
         <w:t xml:space="preserve">right now, and I will build production in front of you from nothing.</w:t>
       </w:r>
     </w:p>
@@ -2532,12 +2653,21 @@
         <w:pStyle w:val="FirstParagraph"/>
       </w:pPr>
       <w:r>
+        <w:rPr>
+          <w:highlight w:val="yellow"/>
+        </w:rPr>
         <w:t xml:space="preserve">Companies leak passwords into their code, they notice, they delete the file, and the password is</w:t>
       </w:r>
       <w:r>
-        <w:t xml:space="preserve"> </w:t>
-      </w:r>
-      <w:r>
+        <w:rPr>
+          <w:highlight w:val="yellow"/>
+        </w:rPr>
+        <w:t xml:space="preserve"> </w:t>
+      </w:r>
+      <w:r>
+        <w:rPr>
+          <w:highlight w:val="yellow"/>
+        </w:rPr>
         <w:t xml:space="preserve">still there.</w:t>
       </w:r>
     </w:p>
@@ -2546,21 +2676,34 @@
         <w:pStyle w:val="BodyText"/>
       </w:pPr>
       <w:r>
+        <w:rPr>
+          <w:highlight w:val="yellow"/>
+        </w:rPr>
         <w:t xml:space="preserve">The repository looks clean afterwards. The commit history says somebody handled it. Nobody handled</w:t>
       </w:r>
       <w:r>
-        <w:t xml:space="preserve"> </w:t>
-      </w:r>
-      <w:r>
+        <w:rPr>
+          <w:highlight w:val="yellow"/>
+        </w:rPr>
+        <w:t xml:space="preserve"> </w:t>
+      </w:r>
+      <w:r>
+        <w:rPr>
+          <w:highlight w:val="yellow"/>
+        </w:rPr>
         <w:t xml:space="preserve">it.</w:t>
       </w:r>
       <w:r>
-        <w:t xml:space="preserve"> </w:t>
-      </w:r>
-      <w:r>
-        <w:rPr>
-          <w:b/>
-          <w:bCs/>
+        <w:rPr>
+          <w:highlight w:val="yellow"/>
+        </w:rPr>
+        <w:t xml:space="preserve"> </w:t>
+      </w:r>
+      <w:r>
+        <w:rPr>
+          <w:b/>
+          <w:bCs/>
+          <w:highlight w:val="yellow"/>
         </w:rPr>
         <w:t xml:space="preserve">That is what I want them to walk away knowing.</w:t>
       </w:r>
@@ -2583,19 +2726,32 @@
         <w:rPr>
           <w:b/>
           <w:bCs/>
+          <w:highlight w:val="yellow"/>
         </w:rPr>
         <w:t xml:space="preserve">1. Show the problem is real.</w:t>
       </w:r>
       <w:r>
-        <w:t xml:space="preserve"> </w:t>
-      </w:r>
-      <w:r>
+        <w:rPr>
+          <w:highlight w:val="yellow"/>
+        </w:rPr>
+        <w:t xml:space="preserve"> </w:t>
+      </w:r>
+      <w:r>
+        <w:rPr>
+          <w:highlight w:val="yellow"/>
+        </w:rPr>
         <w:t xml:space="preserve">Not a slide about it. A password surviving every fix people</w:t>
       </w:r>
       <w:r>
-        <w:t xml:space="preserve"> </w:t>
-      </w:r>
-      <w:r>
+        <w:rPr>
+          <w:highlight w:val="yellow"/>
+        </w:rPr>
+        <w:t xml:space="preserve"> </w:t>
+      </w:r>
+      <w:r>
+        <w:rPr>
+          <w:highlight w:val="yellow"/>
+        </w:rPr>
         <w:t xml:space="preserve">normally apply.</w:t>
       </w:r>
     </w:p>
@@ -2607,13 +2763,20 @@
         <w:rPr>
           <w:b/>
           <w:bCs/>
+          <w:highlight w:val="yellow"/>
         </w:rPr>
         <w:t xml:space="preserve">2. Show a pipeline that stops it.</w:t>
       </w:r>
       <w:r>
-        <w:t xml:space="preserve"> </w:t>
-      </w:r>
-      <w:r>
+        <w:rPr>
+          <w:highlight w:val="yellow"/>
+        </w:rPr>
+        <w:t xml:space="preserve"> </w:t>
+      </w:r>
+      <w:r>
+        <w:rPr>
+          <w:highlight w:val="yellow"/>
+        </w:rPr>
         <w:t xml:space="preserve">Running right now, on hardware in my house. Not a diagram.</w:t>
       </w:r>
     </w:p>
@@ -2625,25 +2788,44 @@
         <w:rPr>
           <w:b/>
           <w:bCs/>
+          <w:highlight w:val="yellow"/>
         </w:rPr>
         <w:t xml:space="preserve">3. Show the judgment, not just the tools.</w:t>
       </w:r>
       <w:r>
-        <w:t xml:space="preserve"> </w:t>
-      </w:r>
-      <w:r>
+        <w:rPr>
+          <w:highlight w:val="yellow"/>
+        </w:rPr>
+        <w:t xml:space="preserve"> </w:t>
+      </w:r>
+      <w:r>
+        <w:rPr>
+          <w:highlight w:val="yellow"/>
+        </w:rPr>
         <w:t xml:space="preserve">Anyone can install a scanner. The hard part is deciding</w:t>
       </w:r>
       <w:r>
-        <w:t xml:space="preserve"> </w:t>
-      </w:r>
-      <w:r>
+        <w:rPr>
+          <w:highlight w:val="yellow"/>
+        </w:rPr>
+        <w:t xml:space="preserve"> </w:t>
+      </w:r>
+      <w:r>
+        <w:rPr>
+          <w:highlight w:val="yellow"/>
+        </w:rPr>
         <w:t xml:space="preserve">what should stop somebody's work, and being able to defend that list to an engineer and to an</w:t>
       </w:r>
       <w:r>
-        <w:t xml:space="preserve"> </w:t>
-      </w:r>
-      <w:r>
+        <w:rPr>
+          <w:highlight w:val="yellow"/>
+        </w:rPr>
+        <w:t xml:space="preserve"> </w:t>
+      </w:r>
+      <w:r>
+        <w:rPr>
+          <w:highlight w:val="yellow"/>
+        </w:rPr>
         <w:t xml:space="preserve">auditor.</w:t>
       </w:r>
     </w:p>
@@ -2655,19 +2837,32 @@
         <w:rPr>
           <w:b/>
           <w:bCs/>
+          <w:highlight w:val="yellow"/>
         </w:rPr>
         <w:t xml:space="preserve">4. Build infrastructure in front of them.</w:t>
       </w:r>
       <w:r>
-        <w:t xml:space="preserve"> </w:t>
-      </w:r>
-      <w:r>
+        <w:rPr>
+          <w:highlight w:val="yellow"/>
+        </w:rPr>
+        <w:t xml:space="preserve"> </w:t>
+      </w:r>
+      <w:r>
+        <w:rPr>
+          <w:highlight w:val="yellow"/>
+        </w:rPr>
         <w:t xml:space="preserve">I change one number, push it, and they watch it go</w:t>
       </w:r>
       <w:r>
-        <w:t xml:space="preserve"> </w:t>
-      </w:r>
-      <w:r>
+        <w:rPr>
+          <w:highlight w:val="yellow"/>
+        </w:rPr>
+        <w:t xml:space="preserve"> </w:t>
+      </w:r>
+      <w:r>
+        <w:rPr>
+          <w:highlight w:val="yellow"/>
+        </w:rPr>
         <w:t xml:space="preserve">through the checks, wait for an approval, and build real servers.</w:t>
       </w:r>
     </w:p>
@@ -2690,6 +2885,9 @@
         </w:numPr>
       </w:pPr>
       <w:r>
+        <w:rPr>
+          <w:highlight w:val="yellow"/>
+        </w:rPr>
         <w:t xml:space="preserve">Secret scanning across the whole git history</w:t>
       </w:r>
     </w:p>
@@ -2702,6 +2900,9 @@
         </w:numPr>
       </w:pPr>
       <w:r>
+        <w:rPr>
+          <w:highlight w:val="yellow"/>
+        </w:rPr>
         <w:t xml:space="preserve">Infrastructure code scanning, with different rules per environment</w:t>
       </w:r>
     </w:p>
@@ -2714,6 +2915,9 @@
         </w:numPr>
       </w:pPr>
       <w:r>
+        <w:rPr>
+          <w:highlight w:val="yellow"/>
+        </w:rPr>
         <w:t xml:space="preserve">A pull request that cannot merge without a review and passing checks</w:t>
       </w:r>
     </w:p>
@@ -2726,6 +2930,9 @@
         </w:numPr>
       </w:pPr>
       <w:r>
+        <w:rPr>
+          <w:highlight w:val="yellow"/>
+        </w:rPr>
         <w:t xml:space="preserve">Development deploying automatically, staging and production waiting for a person</w:t>
       </w:r>
     </w:p>
@@ -2738,6 +2945,9 @@
         </w:numPr>
       </w:pPr>
       <w:r>
+        <w:rPr>
+          <w:highlight w:val="yellow"/>
+        </w:rPr>
         <w:t xml:space="preserve">Terraform building real servers, a separate deploy step installing the application</w:t>
       </w:r>
     </w:p>
@@ -2750,6 +2960,9 @@
         </w:numPr>
       </w:pPr>
       <w:r>
+        <w:rPr>
+          <w:highlight w:val="yellow"/>
+        </w:rPr>
         <w:t xml:space="preserve">Each environment isolated from the others, three independent ways</w:t>
       </w:r>
     </w:p>
@@ -2775,19 +2988,32 @@
         <w:rPr>
           <w:b/>
           <w:bCs/>
+          <w:highlight w:val="yellow"/>
         </w:rPr>
         <w:t xml:space="preserve">No Docker, no Kubernetes.</w:t>
       </w:r>
       <w:r>
-        <w:t xml:space="preserve"> </w:t>
-      </w:r>
-      <w:r>
+        <w:rPr>
+          <w:highlight w:val="yellow"/>
+        </w:rPr>
+        <w:t xml:space="preserve"> </w:t>
+      </w:r>
+      <w:r>
+        <w:rPr>
+          <w:highlight w:val="yellow"/>
+        </w:rPr>
         <w:t xml:space="preserve">These are Linux containers built by Terraform. I will explain why,</w:t>
       </w:r>
       <w:r>
-        <w:t xml:space="preserve"> </w:t>
-      </w:r>
-      <w:r>
+        <w:rPr>
+          <w:highlight w:val="yellow"/>
+        </w:rPr>
+        <w:t xml:space="preserve"> </w:t>
+      </w:r>
+      <w:r>
+        <w:rPr>
+          <w:highlight w:val="yellow"/>
+        </w:rPr>
         <w:t xml:space="preserve">and what would change if you ran Kubernetes.</w:t>
       </w:r>
     </w:p>
@@ -2803,19 +3029,32 @@
         <w:rPr>
           <w:b/>
           <w:bCs/>
+          <w:highlight w:val="yellow"/>
         </w:rPr>
         <w:t xml:space="preserve">No cloud account.</w:t>
       </w:r>
       <w:r>
-        <w:t xml:space="preserve"> </w:t>
-      </w:r>
-      <w:r>
+        <w:rPr>
+          <w:highlight w:val="yellow"/>
+        </w:rPr>
+        <w:t xml:space="preserve"> </w:t>
+      </w:r>
+      <w:r>
+        <w:rPr>
+          <w:highlight w:val="yellow"/>
+        </w:rPr>
         <w:t xml:space="preserve">This runs on a Proxmox server at home instead of AWS. The pipeline is</w:t>
       </w:r>
       <w:r>
-        <w:t xml:space="preserve"> </w:t>
-      </w:r>
-      <w:r>
+        <w:rPr>
+          <w:highlight w:val="yellow"/>
+        </w:rPr>
+        <w:t xml:space="preserve"> </w:t>
+      </w:r>
+      <w:r>
+        <w:rPr>
+          <w:highlight w:val="yellow"/>
+        </w:rPr>
         <w:t xml:space="preserve">identical; only the last command differs.</w:t>
       </w:r>
     </w:p>
@@ -2831,19 +3070,32 @@
         <w:rPr>
           <w:b/>
           <w:bCs/>
+          <w:highlight w:val="yellow"/>
         </w:rPr>
         <w:t xml:space="preserve">No runtime security.</w:t>
       </w:r>
       <w:r>
-        <w:t xml:space="preserve"> </w:t>
-      </w:r>
-      <w:r>
+        <w:rPr>
+          <w:highlight w:val="yellow"/>
+        </w:rPr>
+        <w:t xml:space="preserve"> </w:t>
+      </w:r>
+      <w:r>
+        <w:rPr>
+          <w:highlight w:val="yellow"/>
+        </w:rPr>
         <w:t xml:space="preserve">This stops bad things before deployment. It does not watch what happens</w:t>
       </w:r>
       <w:r>
-        <w:t xml:space="preserve"> </w:t>
-      </w:r>
-      <w:r>
+        <w:rPr>
+          <w:highlight w:val="yellow"/>
+        </w:rPr>
+        <w:t xml:space="preserve"> </w:t>
+      </w:r>
+      <w:r>
+        <w:rPr>
+          <w:highlight w:val="yellow"/>
+        </w:rPr>
         <w:t xml:space="preserve">afterwards.</w:t>
       </w:r>
     </w:p>
@@ -2859,19 +3111,32 @@
         <w:rPr>
           <w:b/>
           <w:bCs/>
+          <w:highlight w:val="yellow"/>
         </w:rPr>
         <w:t xml:space="preserve">One person.</w:t>
       </w:r>
       <w:r>
-        <w:t xml:space="preserve"> </w:t>
-      </w:r>
-      <w:r>
+        <w:rPr>
+          <w:highlight w:val="yellow"/>
+        </w:rPr>
+        <w:t xml:space="preserve"> </w:t>
+      </w:r>
+      <w:r>
+        <w:rPr>
+          <w:highlight w:val="yellow"/>
+        </w:rPr>
         <w:t xml:space="preserve">I am the only account on this repository, so I cannot approve my own work. In a</w:t>
       </w:r>
       <w:r>
-        <w:t xml:space="preserve"> </w:t>
-      </w:r>
-      <w:r>
+        <w:rPr>
+          <w:highlight w:val="yellow"/>
+        </w:rPr>
+        <w:t xml:space="preserve"> </w:t>
+      </w:r>
+      <w:r>
+        <w:rPr>
+          <w:highlight w:val="yellow"/>
+        </w:rPr>
         <w:t xml:space="preserve">real team that is a second engineer.</w:t>
       </w:r>
     </w:p>
@@ -2893,38 +3158,64 @@
         <w:rPr>
           <w:b/>
           <w:bCs/>
+          <w:highlight w:val="yellow"/>
         </w:rPr>
         <w:t xml:space="preserve">This matters and I should say it early.</w:t>
       </w:r>
       <w:r>
-        <w:t xml:space="preserve"> </w:t>
-      </w:r>
-      <w:r>
+        <w:rPr>
+          <w:highlight w:val="yellow"/>
+        </w:rPr>
+        <w:t xml:space="preserve"> </w:t>
+      </w:r>
+      <w:r>
+        <w:rPr>
+          <w:highlight w:val="yellow"/>
+        </w:rPr>
         <w:t xml:space="preserve">There are</w:t>
       </w:r>
       <w:r>
-        <w:t xml:space="preserve"> </w:t>
-      </w:r>
-      <w:r>
-        <w:rPr>
-          <w:b/>
-          <w:bCs/>
+        <w:rPr>
+          <w:highlight w:val="yellow"/>
+        </w:rPr>
+        <w:t xml:space="preserve"> </w:t>
+      </w:r>
+      <w:r>
+        <w:rPr>
+          <w:b/>
+          <w:bCs/>
+          <w:highlight w:val="yellow"/>
         </w:rPr>
         <w:t xml:space="preserve">no application servers running at all</w:t>
       </w:r>
       <w:r>
+        <w:rPr>
+          <w:highlight w:val="yellow"/>
+        </w:rPr>
         <w:t xml:space="preserve">.</w:t>
       </w:r>
       <w:r>
-        <w:t xml:space="preserve"> </w:t>
-      </w:r>
-      <w:r>
+        <w:rPr>
+          <w:highlight w:val="yellow"/>
+        </w:rPr>
+        <w:t xml:space="preserve"> </w:t>
+      </w:r>
+      <w:r>
+        <w:rPr>
+          <w:highlight w:val="yellow"/>
+        </w:rPr>
         <w:t xml:space="preserve">Every one was destroyed with Terraform before the demo started. The platform is up; the thing the</w:t>
       </w:r>
       <w:r>
-        <w:t xml:space="preserve"> </w:t>
-      </w:r>
-      <w:r>
+        <w:rPr>
+          <w:highlight w:val="yellow"/>
+        </w:rPr>
+        <w:t xml:space="preserve"> </w:t>
+      </w:r>
+      <w:r>
+        <w:rPr>
+          <w:highlight w:val="yellow"/>
+        </w:rPr>
         <w:t xml:space="preserve">platform builds is gone.</w:t>
       </w:r>
     </w:p>
@@ -2949,6 +3240,9 @@
               <w:pStyle w:val="Compact"/>
             </w:pPr>
             <w:r>
+              <w:rPr>
+                <w:highlight w:val="yellow"/>
+              </w:rPr>
               <w:t xml:space="preserve">Running now</w:t>
             </w:r>
           </w:p>
@@ -2960,6 +3254,9 @@
               <w:pStyle w:val="Compact"/>
             </w:pPr>
             <w:r>
+              <w:rPr>
+                <w:highlight w:val="yellow"/>
+              </w:rPr>
               <w:t xml:space="preserve">Built during the demo</w:t>
             </w:r>
           </w:p>
@@ -2973,6 +3270,9 @@
               <w:pStyle w:val="Compact"/>
             </w:pPr>
             <w:r>
+              <w:rPr>
+                <w:highlight w:val="yellow"/>
+              </w:rPr>
               <w:t xml:space="preserve">201 ci-dev, 202 ci-stage, 203 ci-prod, 204 tf-state</w:t>
             </w:r>
           </w:p>
@@ -2984,6 +3284,9 @@
               <w:pStyle w:val="Compact"/>
             </w:pPr>
             <w:r>
+              <w:rPr>
+                <w:highlight w:val="yellow"/>
+              </w:rPr>
               <w:t xml:space="preserve">301 app-dev-1</w:t>
             </w:r>
           </w:p>
@@ -2997,6 +3300,9 @@
               <w:pStyle w:val="Compact"/>
             </w:pPr>
             <w:r>
+              <w:rPr>
+                <w:highlight w:val="yellow"/>
+              </w:rPr>
               <w:t xml:space="preserve">the four bridges and the forward policy</w:t>
             </w:r>
           </w:p>
@@ -3008,6 +3314,9 @@
               <w:pStyle w:val="Compact"/>
             </w:pPr>
             <w:r>
+              <w:rPr>
+                <w:highlight w:val="yellow"/>
+              </w:rPr>
               <w:t xml:space="preserve">311 app-stage-1</w:t>
             </w:r>
           </w:p>
@@ -3021,6 +3330,9 @@
               <w:pStyle w:val="Compact"/>
             </w:pPr>
             <w:r>
+              <w:rPr>
+                <w:highlight w:val="yellow"/>
+              </w:rPr>
               <w:t xml:space="preserve">the Proxmox API tokens, the age keys</w:t>
             </w:r>
           </w:p>
@@ -3032,6 +3344,9 @@
               <w:pStyle w:val="Compact"/>
             </w:pPr>
             <w:r>
+              <w:rPr>
+                <w:highlight w:val="yellow"/>
+              </w:rPr>
               <w:t xml:space="preserve">321, 322, 323 app-prod-1, -2, -3</w:t>
             </w:r>
           </w:p>

</xml_diff>

<commit_message>
Highlight everything spoken in the runbook export, with a script so re-exports keep it
Co-Authored-By: Claude Fable 5.1 <noreply@anthropic.com>
</commit_message>
<xml_diff>
--- a/docs/word/1-RUNBOOK.docx
+++ b/docs/word/1-RUNBOOK.docx
@@ -800,59 +800,36 @@
         <w:pStyle w:val="BlockText"/>
       </w:pPr>
       <w:r>
-        <w:rPr>
-          <w:highlight w:val="yellow"/>
-        </w:rPr>
         <w:t xml:space="preserve">Postgres only binds</w:t>
       </w:r>
       <w:r>
-        <w:rPr>
-          <w:highlight w:val="yellow"/>
-        </w:rPr>
-        <w:t xml:space="preserve"> </w:t>
-      </w:r>
-      <w:r>
-        <w:rPr>
-          <w:rStyle w:val="VerbatimChar"/>
-          <w:highlight w:val="yellow"/>
+        <w:t xml:space="preserve"> </w:t>
+      </w:r>
+      <w:r>
+        <w:rPr>
+          <w:rStyle w:val="VerbatimChar"/>
         </w:rPr>
         <w:t xml:space="preserve">10.40.10.10</w:t>
       </w:r>
       <w:r>
-        <w:rPr>
-          <w:highlight w:val="yellow"/>
-        </w:rPr>
-        <w:t xml:space="preserve"> </w:t>
-      </w:r>
-      <w:r>
-        <w:rPr>
-          <w:highlight w:val="yellow"/>
-        </w:rPr>
+        <w:t xml:space="preserve"> </w:t>
+      </w:r>
+      <w:r>
         <w:t xml:space="preserve">if that interface is already up when it starts. After a tf-state</w:t>
       </w:r>
       <w:r>
-        <w:rPr>
-          <w:highlight w:val="yellow"/>
-        </w:rPr>
-        <w:t xml:space="preserve"> </w:t>
-      </w:r>
-      <w:r>
-        <w:rPr>
-          <w:highlight w:val="yellow"/>
-        </w:rPr>
+        <w:t xml:space="preserve"> </w:t>
+      </w:r>
+      <w:r>
         <w:t xml:space="preserve">reboot it can come back on loopback alone, and then</w:t>
       </w:r>
       <w:r>
-        <w:rPr>
-          <w:highlight w:val="yellow"/>
-        </w:rPr>
-        <w:t xml:space="preserve"> </w:t>
-      </w:r>
-      <w:r>
-        <w:rPr>
-          <w:b/>
-          <w:bCs/>
-          <w:highlight w:val="yellow"/>
+        <w:t xml:space="preserve"> </w:t>
+      </w:r>
+      <w:r>
+        <w:rPr>
+          <w:b/>
+          <w:bCs/>
         </w:rPr>
         <w:t xml:space="preserve">every</w:t>
       </w:r>
@@ -860,16 +837,14 @@
         <w:rPr>
           <w:b/>
           <w:bCs/>
-          <w:highlight w:val="yellow"/>
-        </w:rPr>
-        <w:t xml:space="preserve"> </w:t>
-      </w:r>
-      <w:r>
-        <w:rPr>
-          <w:rStyle w:val="VerbatimChar"/>
-          <w:b/>
-          <w:bCs/>
-          <w:highlight w:val="yellow"/>
+        </w:rPr>
+        <w:t xml:space="preserve"> </w:t>
+      </w:r>
+      <w:r>
+        <w:rPr>
+          <w:rStyle w:val="VerbatimChar"/>
+          <w:b/>
+          <w:bCs/>
         </w:rPr>
         <w:t xml:space="preserve">terraform init</w:t>
       </w:r>
@@ -877,47 +852,32 @@
         <w:rPr>
           <w:b/>
           <w:bCs/>
-          <w:highlight w:val="yellow"/>
-        </w:rPr>
-        <w:t xml:space="preserve"> </w:t>
-      </w:r>
-      <w:r>
-        <w:rPr>
-          <w:b/>
-          <w:bCs/>
-          <w:highlight w:val="yellow"/>
+        </w:rPr>
+        <w:t xml:space="preserve"> </w:t>
+      </w:r>
+      <w:r>
+        <w:rPr>
+          <w:b/>
+          <w:bCs/>
         </w:rPr>
         <w:t xml:space="preserve">in the demo fails</w:t>
       </w:r>
       <w:r>
-        <w:rPr>
-          <w:highlight w:val="yellow"/>
-        </w:rPr>
-        <w:t xml:space="preserve"> </w:t>
-      </w:r>
-      <w:r>
-        <w:rPr>
-          <w:highlight w:val="yellow"/>
-        </w:rPr>
+        <w:t xml:space="preserve"> </w:t>
+      </w:r>
+      <w:r>
         <w:t xml:space="preserve">with</w:t>
       </w:r>
       <w:r>
-        <w:rPr>
-          <w:highlight w:val="yellow"/>
-        </w:rPr>
-        <w:t xml:space="preserve"> </w:t>
-      </w:r>
-      <w:r>
-        <w:rPr>
-          <w:rStyle w:val="VerbatimChar"/>
-          <w:highlight w:val="yellow"/>
+        <w:t xml:space="preserve"> </w:t>
+      </w:r>
+      <w:r>
+        <w:rPr>
+          <w:rStyle w:val="VerbatimChar"/>
         </w:rPr>
         <w:t xml:space="preserve">connection refused</w:t>
       </w:r>
       <w:r>
-        <w:rPr>
-          <w:highlight w:val="yellow"/>
-        </w:rPr>
         <w:t xml:space="preserve">. This is the single most likely thing to kill the demo. Check it first.</w:t>
       </w:r>
     </w:p>
@@ -3480,22 +3440,35 @@
         <w:pStyle w:val="FirstParagraph"/>
       </w:pPr>
       <w:r>
+        <w:rPr>
+          <w:highlight w:val="yellow"/>
+        </w:rPr>
         <w:t xml:space="preserve">The</w:t>
       </w:r>
       <w:r>
-        <w:t xml:space="preserve"> </w:t>
-      </w:r>
-      <w:r>
-        <w:rPr>
-          <w:b/>
-          <w:bCs/>
+        <w:rPr>
+          <w:highlight w:val="yellow"/>
+        </w:rPr>
+        <w:t xml:space="preserve"> </w:t>
+      </w:r>
+      <w:r>
+        <w:rPr>
+          <w:b/>
+          <w:bCs/>
+          <w:highlight w:val="yellow"/>
         </w:rPr>
         <w:t xml:space="preserve">"Say, as I start"</w:t>
       </w:r>
       <w:r>
-        <w:t xml:space="preserve"> </w:t>
-      </w:r>
-      <w:r>
+        <w:rPr>
+          <w:highlight w:val="yellow"/>
+        </w:rPr>
+        <w:t xml:space="preserve"> </w:t>
+      </w:r>
+      <w:r>
+        <w:rPr>
+          <w:highlight w:val="yellow"/>
+        </w:rPr>
         <w:t xml:space="preserve">box under each STEP heading is the first thing I say in that step.</w:t>
       </w:r>
     </w:p>
@@ -4107,28 +4080,42 @@
         <w:pStyle w:val="FirstParagraph"/>
       </w:pPr>
       <w:r>
+        <w:rPr>
+          <w:highlight w:val="yellow"/>
+        </w:rPr>
         <w:t xml:space="preserve">Drop</w:t>
       </w:r>
       <w:r>
-        <w:t xml:space="preserve"> </w:t>
-      </w:r>
-      <w:r>
-        <w:rPr>
-          <w:b/>
-          <w:bCs/>
+        <w:rPr>
+          <w:highlight w:val="yellow"/>
+        </w:rPr>
+        <w:t xml:space="preserve"> </w:t>
+      </w:r>
+      <w:r>
+        <w:rPr>
+          <w:b/>
+          <w:bCs/>
+          <w:highlight w:val="yellow"/>
         </w:rPr>
         <w:t xml:space="preserve">Step 4</w:t>
       </w:r>
       <w:r>
+        <w:rPr>
+          <w:highlight w:val="yellow"/>
+        </w:rPr>
         <w:t xml:space="preserve">. Say instead:</w:t>
       </w:r>
       <w:r>
+        <w:rPr>
+          <w:highlight w:val="yellow"/>
+        </w:rPr>
         <w:t xml:space="preserve"> </w:t>
       </w:r>
       <w:r>
         <w:rPr>
           <w:i/>
           <w:iCs/>
+          <w:highlight w:val="yellow"/>
         </w:rPr>
         <w:t xml:space="preserve">"the checks block 10 things in development and 14 in production."</w:t>
       </w:r>
@@ -4313,25 +4300,41 @@
         <w:pStyle w:val="BodyText"/>
       </w:pPr>
       <w:r>
+        <w:rPr>
+          <w:highlight w:val="yellow"/>
+        </w:rPr>
         <w:t xml:space="preserve">The first commit in that repository was called</w:t>
       </w:r>
       <w:r>
+        <w:rPr>
+          <w:highlight w:val="yellow"/>
+        </w:rPr>
         <w:t xml:space="preserve"> </w:t>
       </w:r>
       <w:r>
         <w:rPr>
           <w:i/>
           <w:iCs/>
+          <w:highlight w:val="yellow"/>
         </w:rPr>
         <w:t xml:space="preserve">"Starting up the repository"</w:t>
       </w:r>
       <w:r>
+        <w:rPr>
+          <w:highlight w:val="yellow"/>
+        </w:rPr>
         <w:t xml:space="preserve">. It already had 63 keys</w:t>
       </w:r>
       <w:r>
-        <w:t xml:space="preserve"> </w:t>
-      </w:r>
-      <w:r>
+        <w:rPr>
+          <w:highlight w:val="yellow"/>
+        </w:rPr>
+        <w:t xml:space="preserve"> </w:t>
+      </w:r>
+      <w:r>
+        <w:rPr>
+          <w:highlight w:val="yellow"/>
+        </w:rPr>
         <w:t xml:space="preserve">in it.</w:t>
       </w:r>
     </w:p>
@@ -4520,22 +4523,33 @@
         <w:rPr>
           <w:b/>
           <w:bCs/>
+          <w:highlight w:val="yellow"/>
         </w:rPr>
         <w:t xml:space="preserve">They caught it.</w:t>
       </w:r>
       <w:r>
-        <w:t xml:space="preserve"> </w:t>
-      </w:r>
-      <w:r>
+        <w:rPr>
+          <w:highlight w:val="yellow"/>
+        </w:rPr>
+        <w:t xml:space="preserve"> </w:t>
+      </w:r>
+      <w:r>
+        <w:rPr>
+          <w:highlight w:val="yellow"/>
+        </w:rPr>
         <w:t xml:space="preserve">The very next commit was called</w:t>
       </w:r>
       <w:r>
+        <w:rPr>
+          <w:highlight w:val="yellow"/>
+        </w:rPr>
         <w:t xml:space="preserve"> </w:t>
       </w:r>
       <w:r>
         <w:rPr>
           <w:i/>
           <w:iCs/>
+          <w:highlight w:val="yellow"/>
         </w:rPr>
         <w:t xml:space="preserve">"Add utility for encrypting/decrypting .env</w:t>
       </w:r>
@@ -4543,6 +4557,7 @@
         <w:rPr>
           <w:i/>
           <w:iCs/>
+          <w:highlight w:val="yellow"/>
         </w:rPr>
         <w:t xml:space="preserve"> </w:t>
       </w:r>
@@ -4550,10 +4565,14 @@
         <w:rPr>
           <w:i/>
           <w:iCs/>
+          <w:highlight w:val="yellow"/>
         </w:rPr>
         <w:t xml:space="preserve">files"</w:t>
       </w:r>
       <w:r>
+        <w:rPr>
+          <w:highlight w:val="yellow"/>
+        </w:rPr>
         <w:t xml:space="preserve">. They deleted the file, added it to gitignore, wrote an encryption tool.</w:t>
       </w:r>
     </w:p>
@@ -4644,6 +4663,9 @@
         </w:numPr>
       </w:pPr>
       <w:r>
+        <w:rPr>
+          <w:highlight w:val="yellow"/>
+        </w:rPr>
         <w:t xml:space="preserve">and then I'll show you the password is still there. Press-enter pauses; I'll narrate."</w:t>
       </w:r>
     </w:p>
@@ -4708,13 +4730,20 @@
         <w:rPr>
           <w:b/>
           <w:bCs/>
+          <w:highlight w:val="yellow"/>
         </w:rPr>
         <w:t xml:space="preserve">Setup</w:t>
       </w:r>
       <w:r>
-        <w:t xml:space="preserve"> </w:t>
-      </w:r>
-      <w:r>
+        <w:rPr>
+          <w:highlight w:val="yellow"/>
+        </w:rPr>
+        <w:t xml:space="preserve"> </w:t>
+      </w:r>
+      <w:r>
+        <w:rPr>
+          <w:highlight w:val="yellow"/>
+        </w:rPr>
         <w:t xml:space="preserve">- "an ordinary repository, with a .env in it"</w:t>
       </w:r>
     </w:p>
@@ -4730,13 +4759,20 @@
         <w:rPr>
           <w:b/>
           <w:bCs/>
+          <w:highlight w:val="yellow"/>
         </w:rPr>
         <w:t xml:space="preserve">Fix 1</w:t>
       </w:r>
       <w:r>
-        <w:t xml:space="preserve"> </w:t>
-      </w:r>
-      <w:r>
+        <w:rPr>
+          <w:highlight w:val="yellow"/>
+        </w:rPr>
+        <w:t xml:space="preserve"> </w:t>
+      </w:r>
+      <w:r>
+        <w:rPr>
+          <w:highlight w:val="yellow"/>
+        </w:rPr>
         <w:t xml:space="preserve">- "first instinct, delete the file"</w:t>
       </w:r>
     </w:p>
@@ -4752,13 +4788,20 @@
         <w:rPr>
           <w:b/>
           <w:bCs/>
+          <w:highlight w:val="yellow"/>
         </w:rPr>
         <w:t xml:space="preserve">Fix 2</w:t>
       </w:r>
       <w:r>
-        <w:t xml:space="preserve"> </w:t>
-      </w:r>
-      <w:r>
+        <w:rPr>
+          <w:highlight w:val="yellow"/>
+        </w:rPr>
+        <w:t xml:space="preserve"> </w:t>
+      </w:r>
+      <w:r>
+        <w:rPr>
+          <w:highlight w:val="yellow"/>
+        </w:rPr>
         <w:t xml:space="preserve">- "then make sure it cannot come back"</w:t>
       </w:r>
     </w:p>
@@ -4774,13 +4817,20 @@
         <w:rPr>
           <w:b/>
           <w:bCs/>
+          <w:highlight w:val="yellow"/>
         </w:rPr>
         <w:t xml:space="preserve">Fix 3</w:t>
       </w:r>
       <w:r>
-        <w:t xml:space="preserve"> </w:t>
-      </w:r>
-      <w:r>
+        <w:rPr>
+          <w:highlight w:val="yellow"/>
+        </w:rPr>
+        <w:t xml:space="preserve"> </w:t>
+      </w:r>
+      <w:r>
+        <w:rPr>
+          <w:highlight w:val="yellow"/>
+        </w:rPr>
         <w:t xml:space="preserve">- "then add encryption. This is the real commit message from the real team"</w:t>
       </w:r>
     </w:p>
@@ -5313,13 +5363,20 @@
         <w:rPr>
           <w:b/>
           <w:bCs/>
+          <w:highlight w:val="yellow"/>
         </w:rPr>
         <w:t xml:space="preserve">1. The title.</w:t>
       </w:r>
       <w:r>
-        <w:t xml:space="preserve"> </w:t>
-      </w:r>
-      <w:r>
+        <w:rPr>
+          <w:highlight w:val="yellow"/>
+        </w:rPr>
+        <w:t xml:space="preserve"> </w:t>
+      </w:r>
+      <w:r>
+        <w:rPr>
+          <w:highlight w:val="yellow"/>
+        </w:rPr>
         <w:t xml:space="preserve">"The change is one number. Production goes from two servers to three."</w:t>
       </w:r>
     </w:p>
@@ -5858,6 +5915,7 @@
         <w:rPr>
           <w:b/>
           <w:bCs/>
+          <w:highlight w:val="yellow"/>
         </w:rPr>
         <w:t xml:space="preserve">Prod says</w:t>
       </w:r>
@@ -5865,6 +5923,7 @@
         <w:rPr>
           <w:b/>
           <w:bCs/>
+          <w:highlight w:val="yellow"/>
         </w:rPr>
         <w:t xml:space="preserve"> </w:t>
       </w:r>
@@ -5874,6 +5933,7 @@
           <w:bCs/>
           <w:i/>
           <w:iCs/>
+          <w:highlight w:val="yellow"/>
         </w:rPr>
         <w:t xml:space="preserve">Queued</w:t>
       </w:r>
@@ -5881,6 +5941,7 @@
         <w:rPr>
           <w:b/>
           <w:bCs/>
+          <w:highlight w:val="yellow"/>
         </w:rPr>
         <w:t xml:space="preserve">, not</w:t>
       </w:r>
@@ -5888,6 +5949,7 @@
         <w:rPr>
           <w:b/>
           <w:bCs/>
+          <w:highlight w:val="yellow"/>
         </w:rPr>
         <w:t xml:space="preserve"> </w:t>
       </w:r>
@@ -5897,6 +5959,7 @@
           <w:bCs/>
           <w:i/>
           <w:iCs/>
+          <w:highlight w:val="yellow"/>
         </w:rPr>
         <w:t xml:space="preserve">Waiting</w:t>
       </w:r>
@@ -5904,41 +5967,70 @@
         <w:rPr>
           <w:b/>
           <w:bCs/>
+          <w:highlight w:val="yellow"/>
         </w:rPr>
         <w:t xml:space="preserve">, until stage has finished.</w:t>
       </w:r>
       <w:r>
-        <w:t xml:space="preserve"> </w:t>
-      </w:r>
-      <w:r>
+        <w:rPr>
+          <w:highlight w:val="yellow"/>
+        </w:rPr>
+        <w:t xml:space="preserve"> </w:t>
+      </w:r>
+      <w:r>
+        <w:rPr>
+          <w:highlight w:val="yellow"/>
+        </w:rPr>
         <w:t xml:space="preserve">The deploys run one at a time, in</w:t>
       </w:r>
       <w:r>
-        <w:t xml:space="preserve"> </w:t>
-      </w:r>
-      <w:r>
+        <w:rPr>
+          <w:highlight w:val="yellow"/>
+        </w:rPr>
+        <w:t xml:space="preserve"> </w:t>
+      </w:r>
+      <w:r>
+        <w:rPr>
+          <w:highlight w:val="yellow"/>
+        </w:rPr>
         <w:t xml:space="preserve">order. It flips to</w:t>
       </w:r>
       <w:r>
+        <w:rPr>
+          <w:highlight w:val="yellow"/>
+        </w:rPr>
         <w:t xml:space="preserve"> </w:t>
       </w:r>
       <w:r>
         <w:rPr>
           <w:i/>
           <w:iCs/>
+          <w:highlight w:val="yellow"/>
         </w:rPr>
         <w:t xml:space="preserve">Waiting for review</w:t>
       </w:r>
       <w:r>
-        <w:t xml:space="preserve"> </w:t>
-      </w:r>
-      <w:r>
+        <w:rPr>
+          <w:highlight w:val="yellow"/>
+        </w:rPr>
+        <w:t xml:space="preserve"> </w:t>
+      </w:r>
+      <w:r>
+        <w:rPr>
+          <w:highlight w:val="yellow"/>
+        </w:rPr>
         <w:t xml:space="preserve">on its own once stage is green. Do not read "Queued" as a</w:t>
       </w:r>
       <w:r>
-        <w:t xml:space="preserve"> </w:t>
-      </w:r>
-      <w:r>
+        <w:rPr>
+          <w:highlight w:val="yellow"/>
+        </w:rPr>
+        <w:t xml:space="preserve"> </w:t>
+      </w:r>
+      <w:r>
+        <w:rPr>
+          <w:highlight w:val="yellow"/>
+        </w:rPr>
         <w:t xml:space="preserve">problem.</w:t>
       </w:r>
     </w:p>
@@ -6935,6 +7027,9 @@
               <w:pStyle w:val="Compact"/>
             </w:pPr>
             <w:r>
+              <w:rPr>
+                <w:highlight w:val="yellow"/>
+              </w:rPr>
               <w:t xml:space="preserve">"It decrypted with a key that exists only on this runner. Notice the values are masked, even in a log only I can see."</w:t>
             </w:r>
           </w:p>
@@ -6959,6 +7054,9 @@
               <w:pStyle w:val="Compact"/>
             </w:pPr>
             <w:r>
+              <w:rPr>
+                <w:highlight w:val="yellow"/>
+              </w:rPr>
               <w:t xml:space="preserve">"Connecting to its own database on the state machine. Its own schema, its own role."</w:t>
             </w:r>
           </w:p>
@@ -6983,6 +7081,9 @@
               <w:pStyle w:val="Compact"/>
             </w:pPr>
             <w:r>
+              <w:rPr>
+                <w:highlight w:val="yellow"/>
+              </w:rPr>
               <w:t xml:space="preserve">"One to add. This is the plan, saved to a file."</w:t>
             </w:r>
           </w:p>
@@ -7007,6 +7108,9 @@
               <w:pStyle w:val="Compact"/>
             </w:pPr>
             <w:r>
+              <w:rPr>
+                <w:highlight w:val="yellow"/>
+              </w:rPr>
               <w:t xml:space="preserve">"Checkov has no rules for Proxmox, so this checks the plan directly. Unprivileged, boot on, delete protection. Production has to pass all three."</w:t>
             </w:r>
           </w:p>
@@ -7031,6 +7135,9 @@
               <w:pStyle w:val="Compact"/>
             </w:pPr>
             <w:r>
+              <w:rPr>
+                <w:highlight w:val="yellow"/>
+              </w:rPr>
               <w:t xml:space="preserve">"It applies the saved plan file, not a fresh one. What was checked is what gets built, with no window in between."</w:t>
             </w:r>
           </w:p>
@@ -7569,6 +7676,9 @@
         <w:pStyle w:val="FirstParagraph"/>
       </w:pPr>
       <w:r>
+        <w:rPr>
+          <w:highlight w:val="yellow"/>
+        </w:rPr>
         <w:t xml:space="preserve">Seven steps, on any container not already serving:</w:t>
       </w:r>
     </w:p>
@@ -7584,25 +7694,39 @@
         <w:rPr>
           <w:b/>
           <w:bCs/>
+          <w:highlight w:val="yellow"/>
         </w:rPr>
         <w:t xml:space="preserve">Creates a service account</w:t>
       </w:r>
       <w:r>
-        <w:t xml:space="preserve"> </w:t>
-      </w:r>
-      <w:r>
+        <w:rPr>
+          <w:highlight w:val="yellow"/>
+        </w:rPr>
+        <w:t xml:space="preserve"> </w:t>
+      </w:r>
+      <w:r>
+        <w:rPr>
+          <w:highlight w:val="yellow"/>
+        </w:rPr>
         <w:t xml:space="preserve">called</w:t>
       </w:r>
       <w:r>
-        <w:t xml:space="preserve"> </w:t>
-      </w:r>
-      <w:r>
-        <w:rPr>
-          <w:rStyle w:val="VerbatimChar"/>
+        <w:rPr>
+          <w:highlight w:val="yellow"/>
+        </w:rPr>
+        <w:t xml:space="preserve"> </w:t>
+      </w:r>
+      <w:r>
+        <w:rPr>
+          <w:rStyle w:val="VerbatimChar"/>
+          <w:highlight w:val="yellow"/>
         </w:rPr>
         <w:t xml:space="preserve">rapta</w:t>
       </w:r>
       <w:r>
+        <w:rPr>
+          <w:highlight w:val="yellow"/>
+        </w:rPr>
         <w:t xml:space="preserve">. The application does not run as root.</w:t>
       </w:r>
     </w:p>
@@ -7618,13 +7742,20 @@
         <w:rPr>
           <w:b/>
           <w:bCs/>
+          <w:highlight w:val="yellow"/>
         </w:rPr>
         <w:t xml:space="preserve">Installs Python and curl</w:t>
       </w:r>
       <w:r>
-        <w:t xml:space="preserve"> </w:t>
-      </w:r>
-      <w:r>
+        <w:rPr>
+          <w:highlight w:val="yellow"/>
+        </w:rPr>
+        <w:t xml:space="preserve"> </w:t>
+      </w:r>
+      <w:r>
+        <w:rPr>
+          <w:highlight w:val="yellow"/>
+        </w:rPr>
         <w:t xml:space="preserve">if missing.</w:t>
       </w:r>
     </w:p>
@@ -7640,25 +7771,39 @@
         <w:rPr>
           <w:b/>
           <w:bCs/>
+          <w:highlight w:val="yellow"/>
         </w:rPr>
         <w:t xml:space="preserve">Copies the release</w:t>
       </w:r>
       <w:r>
-        <w:t xml:space="preserve"> </w:t>
-      </w:r>
-      <w:r>
+        <w:rPr>
+          <w:highlight w:val="yellow"/>
+        </w:rPr>
+        <w:t xml:space="preserve"> </w:t>
+      </w:r>
+      <w:r>
+        <w:rPr>
+          <w:highlight w:val="yellow"/>
+        </w:rPr>
         <w:t xml:space="preserve">into its own folder,</w:t>
       </w:r>
       <w:r>
-        <w:t xml:space="preserve"> </w:t>
-      </w:r>
-      <w:r>
-        <w:rPr>
-          <w:rStyle w:val="VerbatimChar"/>
+        <w:rPr>
+          <w:highlight w:val="yellow"/>
+        </w:rPr>
+        <w:t xml:space="preserve"> </w:t>
+      </w:r>
+      <w:r>
+        <w:rPr>
+          <w:rStyle w:val="VerbatimChar"/>
+          <w:highlight w:val="yellow"/>
         </w:rPr>
         <w:t xml:space="preserve">releases/1.1.0</w:t>
       </w:r>
       <w:r>
+        <w:rPr>
+          <w:highlight w:val="yellow"/>
+        </w:rPr>
         <w:t xml:space="preserve">. The old release stays on disk.</w:t>
       </w:r>
     </w:p>
@@ -7674,19 +7819,32 @@
         <w:rPr>
           <w:b/>
           <w:bCs/>
+          <w:highlight w:val="yellow"/>
         </w:rPr>
         <w:t xml:space="preserve">Builds a virtual environment</w:t>
       </w:r>
       <w:r>
-        <w:t xml:space="preserve"> </w:t>
-      </w:r>
-      <w:r>
+        <w:rPr>
+          <w:highlight w:val="yellow"/>
+        </w:rPr>
+        <w:t xml:space="preserve"> </w:t>
+      </w:r>
+      <w:r>
+        <w:rPr>
+          <w:highlight w:val="yellow"/>
+        </w:rPr>
         <w:t xml:space="preserve">inside that release folder, so two releases can need different</w:t>
       </w:r>
       <w:r>
-        <w:t xml:space="preserve"> </w:t>
-      </w:r>
-      <w:r>
+        <w:rPr>
+          <w:highlight w:val="yellow"/>
+        </w:rPr>
+        <w:t xml:space="preserve"> </w:t>
+      </w:r>
+      <w:r>
+        <w:rPr>
+          <w:highlight w:val="yellow"/>
+        </w:rPr>
         <w:t xml:space="preserve">packages without fighting.</w:t>
       </w:r>
     </w:p>
@@ -7702,53 +7860,84 @@
         <w:rPr>
           <w:b/>
           <w:bCs/>
+          <w:highlight w:val="yellow"/>
         </w:rPr>
         <w:t xml:space="preserve">Moves one symlink</w:t>
       </w:r>
       <w:r>
+        <w:rPr>
+          <w:highlight w:val="yellow"/>
+        </w:rPr>
         <w:t xml:space="preserve">,</w:t>
       </w:r>
       <w:r>
-        <w:t xml:space="preserve"> </w:t>
-      </w:r>
-      <w:r>
-        <w:rPr>
-          <w:rStyle w:val="VerbatimChar"/>
+        <w:rPr>
+          <w:highlight w:val="yellow"/>
+        </w:rPr>
+        <w:t xml:space="preserve"> </w:t>
+      </w:r>
+      <w:r>
+        <w:rPr>
+          <w:rStyle w:val="VerbatimChar"/>
+          <w:highlight w:val="yellow"/>
         </w:rPr>
         <w:t xml:space="preserve">current</w:t>
       </w:r>
       <w:r>
-        <w:t xml:space="preserve"> </w:t>
-      </w:r>
-      <w:r>
+        <w:rPr>
+          <w:highlight w:val="yellow"/>
+        </w:rPr>
+        <w:t xml:space="preserve"> </w:t>
+      </w:r>
+      <w:r>
+        <w:rPr>
+          <w:highlight w:val="yellow"/>
+        </w:rPr>
         <w:t xml:space="preserve">to</w:t>
       </w:r>
       <w:r>
-        <w:t xml:space="preserve"> </w:t>
-      </w:r>
-      <w:r>
-        <w:rPr>
-          <w:rStyle w:val="VerbatimChar"/>
+        <w:rPr>
+          <w:highlight w:val="yellow"/>
+        </w:rPr>
+        <w:t xml:space="preserve"> </w:t>
+      </w:r>
+      <w:r>
+        <w:rPr>
+          <w:rStyle w:val="VerbatimChar"/>
+          <w:highlight w:val="yellow"/>
         </w:rPr>
         <w:t xml:space="preserve">releases/1.1.0</w:t>
       </w:r>
       <w:r>
+        <w:rPr>
+          <w:highlight w:val="yellow"/>
+        </w:rPr>
         <w:t xml:space="preserve">. That single pointer move</w:t>
       </w:r>
       <w:r>
+        <w:rPr>
+          <w:highlight w:val="yellow"/>
+        </w:rPr>
         <w:t xml:space="preserve"> </w:t>
       </w:r>
       <w:r>
         <w:rPr>
           <w:i/>
           <w:iCs/>
+          <w:highlight w:val="yellow"/>
         </w:rPr>
         <w:t xml:space="preserve">is</w:t>
       </w:r>
       <w:r>
-        <w:t xml:space="preserve"> </w:t>
-      </w:r>
-      <w:r>
+        <w:rPr>
+          <w:highlight w:val="yellow"/>
+        </w:rPr>
+        <w:t xml:space="preserve"> </w:t>
+      </w:r>
+      <w:r>
+        <w:rPr>
+          <w:highlight w:val="yellow"/>
+        </w:rPr>
         <w:t xml:space="preserve">the release.</w:t>
       </w:r>
     </w:p>
@@ -7764,28 +7953,45 @@
         <w:rPr>
           <w:b/>
           <w:bCs/>
+          <w:highlight w:val="yellow"/>
         </w:rPr>
         <w:t xml:space="preserve">Installs the systemd unit</w:t>
       </w:r>
       <w:r>
+        <w:rPr>
+          <w:highlight w:val="yellow"/>
+        </w:rPr>
         <w:t xml:space="preserve">, which points at</w:t>
       </w:r>
       <w:r>
-        <w:t xml:space="preserve"> </w:t>
-      </w:r>
-      <w:r>
-        <w:rPr>
-          <w:rStyle w:val="VerbatimChar"/>
+        <w:rPr>
+          <w:highlight w:val="yellow"/>
+        </w:rPr>
+        <w:t xml:space="preserve"> </w:t>
+      </w:r>
+      <w:r>
+        <w:rPr>
+          <w:rStyle w:val="VerbatimChar"/>
+          <w:highlight w:val="yellow"/>
         </w:rPr>
         <w:t xml:space="preserve">current</w:t>
       </w:r>
       <w:r>
+        <w:rPr>
+          <w:highlight w:val="yellow"/>
+        </w:rPr>
         <w:t xml:space="preserve">, never at a version number. That is why a</w:t>
       </w:r>
       <w:r>
-        <w:t xml:space="preserve"> </w:t>
-      </w:r>
-      <w:r>
+        <w:rPr>
+          <w:highlight w:val="yellow"/>
+        </w:rPr>
+        <w:t xml:space="preserve"> </w:t>
+      </w:r>
+      <w:r>
+        <w:rPr>
+          <w:highlight w:val="yellow"/>
+        </w:rPr>
         <w:t xml:space="preserve">rollback needs no file edited. Move the symlink back and restart.</w:t>
       </w:r>
     </w:p>
@@ -7801,25 +8007,44 @@
         <w:rPr>
           <w:b/>
           <w:bCs/>
+          <w:highlight w:val="yellow"/>
         </w:rPr>
         <w:t xml:space="preserve">Waits for the health check to pass</w:t>
       </w:r>
       <w:r>
-        <w:t xml:space="preserve"> </w:t>
-      </w:r>
-      <w:r>
+        <w:rPr>
+          <w:highlight w:val="yellow"/>
+        </w:rPr>
+        <w:t xml:space="preserve"> </w:t>
+      </w:r>
+      <w:r>
+        <w:rPr>
+          <w:highlight w:val="yellow"/>
+        </w:rPr>
         <w:t xml:space="preserve">before reporting success. The application deliberately</w:t>
       </w:r>
       <w:r>
-        <w:t xml:space="preserve"> </w:t>
-      </w:r>
-      <w:r>
+        <w:rPr>
+          <w:highlight w:val="yellow"/>
+        </w:rPr>
+        <w:t xml:space="preserve"> </w:t>
+      </w:r>
+      <w:r>
+        <w:rPr>
+          <w:highlight w:val="yellow"/>
+        </w:rPr>
         <w:t xml:space="preserve">answers 503 for the first two seconds, so a check that fires immediately would report a false</w:t>
       </w:r>
       <w:r>
-        <w:t xml:space="preserve"> </w:t>
-      </w:r>
-      <w:r>
+        <w:rPr>
+          <w:highlight w:val="yellow"/>
+        </w:rPr>
+        <w:t xml:space="preserve"> </w:t>
+      </w:r>
+      <w:r>
+        <w:rPr>
+          <w:highlight w:val="yellow"/>
+        </w:rPr>
         <w:t xml:space="preserve">failure.</w:t>
       </w:r>
     </w:p>
@@ -8220,22 +8445,33 @@
         <w:rPr>
           <w:b/>
           <w:bCs/>
+          <w:highlight w:val="yellow"/>
         </w:rPr>
         <w:t xml:space="preserve">The callback.</w:t>
       </w:r>
       <w:r>
-        <w:t xml:space="preserve"> </w:t>
-      </w:r>
-      <w:r>
+        <w:rPr>
+          <w:highlight w:val="yellow"/>
+        </w:rPr>
+        <w:t xml:space="preserve"> </w:t>
+      </w:r>
+      <w:r>
+        <w:rPr>
+          <w:highlight w:val="yellow"/>
+        </w:rPr>
         <w:t xml:space="preserve">Every one of those five just said</w:t>
       </w:r>
       <w:r>
+        <w:rPr>
+          <w:highlight w:val="yellow"/>
+        </w:rPr>
         <w:t xml:space="preserve"> </w:t>
       </w:r>
       <w:r>
         <w:rPr>
           <w:i/>
           <w:iCs/>
+          <w:highlight w:val="yellow"/>
         </w:rPr>
         <w:t xml:space="preserve">"Hello World, Hello Guys This is George and nice</w:t>
       </w:r>
@@ -8243,6 +8479,7 @@
         <w:rPr>
           <w:i/>
           <w:iCs/>
+          <w:highlight w:val="yellow"/>
         </w:rPr>
         <w:t xml:space="preserve"> </w:t>
       </w:r>
@@ -8250,28 +8487,45 @@
         <w:rPr>
           <w:i/>
           <w:iCs/>
+          <w:highlight w:val="yellow"/>
         </w:rPr>
         <w:t xml:space="preserve">to meet you"</w:t>
       </w:r>
       <w:r>
-        <w:t xml:space="preserve"> </w:t>
-      </w:r>
-      <w:r>
+        <w:rPr>
+          <w:highlight w:val="yellow"/>
+        </w:rPr>
+        <w:t xml:space="preserve"> </w:t>
+      </w:r>
+      <w:r>
+        <w:rPr>
+          <w:highlight w:val="yellow"/>
+        </w:rPr>
         <w:t xml:space="preserve">— the greeting I opened with, ninety minutes of build later, coming back out of a</w:t>
       </w:r>
       <w:r>
-        <w:t xml:space="preserve"> </w:t>
-      </w:r>
-      <w:r>
+        <w:rPr>
+          <w:highlight w:val="yellow"/>
+        </w:rPr>
+        <w:t xml:space="preserve"> </w:t>
+      </w:r>
+      <w:r>
+        <w:rPr>
+          <w:highlight w:val="yellow"/>
+        </w:rPr>
         <w:t xml:space="preserve">machine that did not exist when I said it.</w:t>
       </w:r>
       <w:r>
-        <w:t xml:space="preserve"> </w:t>
-      </w:r>
-      <w:r>
-        <w:rPr>
-          <w:b/>
-          <w:bCs/>
+        <w:rPr>
+          <w:highlight w:val="yellow"/>
+        </w:rPr>
+        <w:t xml:space="preserve"> </w:t>
+      </w:r>
+      <w:r>
+        <w:rPr>
+          <w:b/>
+          <w:bCs/>
+          <w:highlight w:val="yellow"/>
         </w:rPr>
         <w:t xml:space="preserve">Do not explain it. Just let it sit for a beat.</w:t>
       </w:r>
@@ -8295,6 +8549,7 @@
         <w:rPr>
           <w:b/>
           <w:bCs/>
+          <w:highlight w:val="yellow"/>
         </w:rPr>
         <w:t xml:space="preserve">Say, as I stop sharing:</w:t>
       </w:r>
@@ -8318,6 +8573,7 @@
         <w:rPr>
           <w:b/>
           <w:bCs/>
+          <w:highlight w:val="yellow"/>
         </w:rPr>
         <w:t xml:space="preserve">Stop sharing. Face them.</w:t>
       </w:r>
@@ -8330,13 +8586,20 @@
         <w:rPr>
           <w:b/>
           <w:bCs/>
+          <w:highlight w:val="yellow"/>
         </w:rPr>
         <w:t xml:space="preserve">1.</w:t>
       </w:r>
       <w:r>
-        <w:t xml:space="preserve"> </w:t>
-      </w:r>
-      <w:r>
+        <w:rPr>
+          <w:highlight w:val="yellow"/>
+        </w:rPr>
+        <w:t xml:space="preserve"> </w:t>
+      </w:r>
+      <w:r>
+        <w:rPr>
+          <w:highlight w:val="yellow"/>
+        </w:rPr>
         <w:t xml:space="preserve">Deleting a password from git does not remove it. Change the password first, clean up second.</w:t>
       </w:r>
     </w:p>
@@ -8348,19 +8611,32 @@
         <w:rPr>
           <w:b/>
           <w:bCs/>
+          <w:highlight w:val="yellow"/>
         </w:rPr>
         <w:t xml:space="preserve">2.</w:t>
       </w:r>
       <w:r>
-        <w:t xml:space="preserve"> </w:t>
-      </w:r>
-      <w:r>
+        <w:rPr>
+          <w:highlight w:val="yellow"/>
+        </w:rPr>
+        <w:t xml:space="preserve"> </w:t>
+      </w:r>
+      <w:r>
+        <w:rPr>
+          <w:highlight w:val="yellow"/>
+        </w:rPr>
         <w:t xml:space="preserve">When something is wrong for nine months and nobody notices, the system made it easy to get</w:t>
       </w:r>
       <w:r>
-        <w:t xml:space="preserve"> </w:t>
-      </w:r>
-      <w:r>
+        <w:rPr>
+          <w:highlight w:val="yellow"/>
+        </w:rPr>
+        <w:t xml:space="preserve"> </w:t>
+      </w:r>
+      <w:r>
+        <w:rPr>
+          <w:highlight w:val="yellow"/>
+        </w:rPr>
         <w:t xml:space="preserve">wrong. Fix the system, not the people.</w:t>
       </w:r>
     </w:p>
@@ -8372,19 +8648,32 @@
         <w:rPr>
           <w:b/>
           <w:bCs/>
+          <w:highlight w:val="yellow"/>
         </w:rPr>
         <w:t xml:space="preserve">3.</w:t>
       </w:r>
       <w:r>
-        <w:t xml:space="preserve"> </w:t>
-      </w:r>
-      <w:r>
+        <w:rPr>
+          <w:highlight w:val="yellow"/>
+        </w:rPr>
+        <w:t xml:space="preserve"> </w:t>
+      </w:r>
+      <w:r>
+        <w:rPr>
+          <w:highlight w:val="yellow"/>
+        </w:rPr>
         <w:t xml:space="preserve">The hard part is not running the scanner. It is choosing what is worth blocking, and being able</w:t>
       </w:r>
       <w:r>
-        <w:t xml:space="preserve"> </w:t>
-      </w:r>
-      <w:r>
+        <w:rPr>
+          <w:highlight w:val="yellow"/>
+        </w:rPr>
+        <w:t xml:space="preserve"> </w:t>
+      </w:r>
+      <w:r>
+        <w:rPr>
+          <w:highlight w:val="yellow"/>
+        </w:rPr>
         <w:t xml:space="preserve">to defend that choice to an engineer and to an auditor.</w:t>
       </w:r>
     </w:p>
@@ -8425,6 +8714,9 @@
         <w:pStyle w:val="FirstParagraph"/>
       </w:pPr>
       <w:r>
+        <w:rPr>
+          <w:highlight w:val="yellow"/>
+        </w:rPr>
         <w:t xml:space="preserve">---# PART D - THE CLOSE</w:t>
       </w:r>
     </w:p>
@@ -8671,22 +8963,33 @@
         <w:rPr>
           <w:b/>
           <w:bCs/>
+          <w:highlight w:val="yellow"/>
         </w:rPr>
         <w:t xml:space="preserve">1.</w:t>
       </w:r>
       <w:r>
-        <w:t xml:space="preserve"> </w:t>
-      </w:r>
-      <w:r>
+        <w:rPr>
+          <w:highlight w:val="yellow"/>
+        </w:rPr>
+        <w:t xml:space="preserve"> </w:t>
+      </w:r>
+      <w:r>
+        <w:rPr>
+          <w:highlight w:val="yellow"/>
+        </w:rPr>
         <w:t xml:space="preserve">Deleting a password from git does not remove it.</w:t>
       </w:r>
       <w:r>
-        <w:t xml:space="preserve"> </w:t>
-      </w:r>
-      <w:r>
-        <w:rPr>
-          <w:b/>
-          <w:bCs/>
+        <w:rPr>
+          <w:highlight w:val="yellow"/>
+        </w:rPr>
+        <w:t xml:space="preserve"> </w:t>
+      </w:r>
+      <w:r>
+        <w:rPr>
+          <w:b/>
+          <w:bCs/>
+          <w:highlight w:val="yellow"/>
         </w:rPr>
         <w:t xml:space="preserve">Change the password first, clean up</w:t>
       </w:r>
@@ -8694,26 +8997,40 @@
         <w:rPr>
           <w:b/>
           <w:bCs/>
-        </w:rPr>
-        <w:t xml:space="preserve"> </w:t>
-      </w:r>
-      <w:r>
-        <w:rPr>
-          <w:b/>
-          <w:bCs/>
+          <w:highlight w:val="yellow"/>
+        </w:rPr>
+        <w:t xml:space="preserve"> </w:t>
+      </w:r>
+      <w:r>
+        <w:rPr>
+          <w:b/>
+          <w:bCs/>
+          <w:highlight w:val="yellow"/>
         </w:rPr>
         <w:t xml:space="preserve">second.</w:t>
       </w:r>
       <w:r>
-        <w:t xml:space="preserve"> </w:t>
-      </w:r>
-      <w:r>
+        <w:rPr>
+          <w:highlight w:val="yellow"/>
+        </w:rPr>
+        <w:t xml:space="preserve"> </w:t>
+      </w:r>
+      <w:r>
+        <w:rPr>
+          <w:highlight w:val="yellow"/>
+        </w:rPr>
         <w:t xml:space="preserve">The order matters more than the steps, because rotation takes minutes and history rewriting</w:t>
       </w:r>
       <w:r>
-        <w:t xml:space="preserve"> </w:t>
-      </w:r>
-      <w:r>
+        <w:rPr>
+          <w:highlight w:val="yellow"/>
+        </w:rPr>
+        <w:t xml:space="preserve"> </w:t>
+      </w:r>
+      <w:r>
+        <w:rPr>
+          <w:highlight w:val="yellow"/>
+        </w:rPr>
         <w:t xml:space="preserve">takes days.</w:t>
       </w:r>
     </w:p>
@@ -8725,22 +9042,33 @@
         <w:rPr>
           <w:b/>
           <w:bCs/>
+          <w:highlight w:val="yellow"/>
         </w:rPr>
         <w:t xml:space="preserve">2.</w:t>
       </w:r>
       <w:r>
-        <w:t xml:space="preserve"> </w:t>
-      </w:r>
-      <w:r>
+        <w:rPr>
+          <w:highlight w:val="yellow"/>
+        </w:rPr>
+        <w:t xml:space="preserve"> </w:t>
+      </w:r>
+      <w:r>
+        <w:rPr>
+          <w:highlight w:val="yellow"/>
+        </w:rPr>
         <w:t xml:space="preserve">When something is wrong for nine months and nobody notices,</w:t>
       </w:r>
       <w:r>
-        <w:t xml:space="preserve"> </w:t>
-      </w:r>
-      <w:r>
-        <w:rPr>
-          <w:b/>
-          <w:bCs/>
+        <w:rPr>
+          <w:highlight w:val="yellow"/>
+        </w:rPr>
+        <w:t xml:space="preserve"> </w:t>
+      </w:r>
+      <w:r>
+        <w:rPr>
+          <w:b/>
+          <w:bCs/>
+          <w:highlight w:val="yellow"/>
         </w:rPr>
         <w:t xml:space="preserve">the system made it easy to get</w:t>
       </w:r>
@@ -8748,26 +9076,40 @@
         <w:rPr>
           <w:b/>
           <w:bCs/>
-        </w:rPr>
-        <w:t xml:space="preserve"> </w:t>
-      </w:r>
-      <w:r>
-        <w:rPr>
-          <w:b/>
-          <w:bCs/>
+          <w:highlight w:val="yellow"/>
+        </w:rPr>
+        <w:t xml:space="preserve"> </w:t>
+      </w:r>
+      <w:r>
+        <w:rPr>
+          <w:b/>
+          <w:bCs/>
+          <w:highlight w:val="yellow"/>
         </w:rPr>
         <w:t xml:space="preserve">wrong.</w:t>
       </w:r>
       <w:r>
-        <w:t xml:space="preserve"> </w:t>
-      </w:r>
-      <w:r>
+        <w:rPr>
+          <w:highlight w:val="yellow"/>
+        </w:rPr>
+        <w:t xml:space="preserve"> </w:t>
+      </w:r>
+      <w:r>
+        <w:rPr>
+          <w:highlight w:val="yellow"/>
+        </w:rPr>
         <w:t xml:space="preserve">Sixteen commits added private keys and every one passed code review. Fix the system, not the</w:t>
       </w:r>
       <w:r>
-        <w:t xml:space="preserve"> </w:t>
-      </w:r>
-      <w:r>
+        <w:rPr>
+          <w:highlight w:val="yellow"/>
+        </w:rPr>
+        <w:t xml:space="preserve"> </w:t>
+      </w:r>
+      <w:r>
+        <w:rPr>
+          <w:highlight w:val="yellow"/>
+        </w:rPr>
         <w:t xml:space="preserve">people.</w:t>
       </w:r>
     </w:p>
@@ -8779,32 +9121,52 @@
         <w:rPr>
           <w:b/>
           <w:bCs/>
+          <w:highlight w:val="yellow"/>
         </w:rPr>
         <w:t xml:space="preserve">3.</w:t>
       </w:r>
       <w:r>
-        <w:t xml:space="preserve"> </w:t>
-      </w:r>
-      <w:r>
+        <w:rPr>
+          <w:highlight w:val="yellow"/>
+        </w:rPr>
+        <w:t xml:space="preserve"> </w:t>
+      </w:r>
+      <w:r>
+        <w:rPr>
+          <w:highlight w:val="yellow"/>
+        </w:rPr>
         <w:t xml:space="preserve">The hard part is not running the scanner. It is</w:t>
       </w:r>
       <w:r>
-        <w:t xml:space="preserve"> </w:t>
-      </w:r>
-      <w:r>
-        <w:rPr>
-          <w:b/>
-          <w:bCs/>
+        <w:rPr>
+          <w:highlight w:val="yellow"/>
+        </w:rPr>
+        <w:t xml:space="preserve"> </w:t>
+      </w:r>
+      <w:r>
+        <w:rPr>
+          <w:b/>
+          <w:bCs/>
+          <w:highlight w:val="yellow"/>
         </w:rPr>
         <w:t xml:space="preserve">choosing what is worth blocking</w:t>
       </w:r>
       <w:r>
+        <w:rPr>
+          <w:highlight w:val="yellow"/>
+        </w:rPr>
         <w:t xml:space="preserve">, and being</w:t>
       </w:r>
       <w:r>
-        <w:t xml:space="preserve"> </w:t>
-      </w:r>
-      <w:r>
+        <w:rPr>
+          <w:highlight w:val="yellow"/>
+        </w:rPr>
+        <w:t xml:space="preserve"> </w:t>
+      </w:r>
+      <w:r>
+        <w:rPr>
+          <w:highlight w:val="yellow"/>
+        </w:rPr>
         <w:t xml:space="preserve">able to defend that choice to an engineer who wants to ship and to an auditor who wants evidence.</w:t>
       </w:r>
     </w:p>
@@ -8874,21 +9236,34 @@
               <w:pStyle w:val="Compact"/>
             </w:pPr>
             <w:r>
+              <w:rPr>
+                <w:highlight w:val="yellow"/>
+              </w:rPr>
               <w:t xml:space="preserve">Nothing here needs it. The pipeline is identical; the last command would be</w:t>
             </w:r>
             <w:r>
+              <w:rPr>
+                <w:highlight w:val="yellow"/>
+              </w:rPr>
               <w:t xml:space="preserve"> </w:t>
             </w:r>
             <w:r>
               <w:rPr>
                 <w:rStyle w:val="VerbatimChar"/>
+                <w:highlight w:val="yellow"/>
               </w:rPr>
               <w:t xml:space="preserve">kubectl</w:t>
             </w:r>
             <w:r>
+              <w:rPr>
+                <w:highlight w:val="yellow"/>
+              </w:rPr>
               <w:t xml:space="preserve"> </w:t>
             </w:r>
             <w:r>
+              <w:rPr>
+                <w:highlight w:val="yellow"/>
+              </w:rPr>
               <w:t xml:space="preserve">or a Helm release instead of the Proxmox API. Adding Kubernetes would add a control plane to secure without changing anything I showed you.</w:t>
             </w:r>
           </w:p>
@@ -8913,18 +9288,28 @@
               <w:pStyle w:val="Compact"/>
             </w:pPr>
             <w:r>
+              <w:rPr>
+                <w:highlight w:val="yellow"/>
+              </w:rPr>
               <w:t xml:space="preserve">No cloud account in the demo. The Terraform for the AWS platform tier is in the repo under</w:t>
             </w:r>
             <w:r>
+              <w:rPr>
+                <w:highlight w:val="yellow"/>
+              </w:rPr>
               <w:t xml:space="preserve"> </w:t>
             </w:r>
             <w:r>
               <w:rPr>
                 <w:rStyle w:val="VerbatimChar"/>
+                <w:highlight w:val="yellow"/>
               </w:rPr>
               <w:t xml:space="preserve">terraform/envs/</w:t>
             </w:r>
             <w:r>
+              <w:rPr>
+                <w:highlight w:val="yellow"/>
+              </w:rPr>
               <w:t xml:space="preserve">. Only the provider and the final call differ.</w:t>
             </w:r>
           </w:p>
@@ -8949,21 +9334,34 @@
               <w:pStyle w:val="Compact"/>
             </w:pPr>
             <w:r>
+              <w:rPr>
+                <w:highlight w:val="yellow"/>
+              </w:rPr>
               <w:t xml:space="preserve">Three independent boundaries: network, cryptography, database. Each is tested in</w:t>
             </w:r>
             <w:r>
+              <w:rPr>
+                <w:highlight w:val="yellow"/>
+              </w:rPr>
               <w:t xml:space="preserve"> </w:t>
             </w:r>
             <w:r>
               <w:rPr>
                 <w:rStyle w:val="VerbatimChar"/>
+                <w:highlight w:val="yellow"/>
               </w:rPr>
               <w:t xml:space="preserve">validate.sh</w:t>
             </w:r>
             <w:r>
+              <w:rPr>
+                <w:highlight w:val="yellow"/>
+              </w:rPr>
               <w:t xml:space="preserve"> </w:t>
             </w:r>
             <w:r>
+              <w:rPr>
+                <w:highlight w:val="yellow"/>
+              </w:rPr>
               <w:t xml:space="preserve">groups 6, 7 and 8, and I can run it now.</w:t>
             </w:r>
           </w:p>
@@ -8988,6 +9386,9 @@
               <w:pStyle w:val="Compact"/>
             </w:pPr>
             <w:r>
+              <w:rPr>
+                <w:highlight w:val="yellow"/>
+              </w:rPr>
               <w:t xml:space="preserve">They can schedule jobs. They get encrypted files they cannot open. Every credential lives on a runner behind NAT with no inbound path.</w:t>
             </w:r>
           </w:p>
@@ -9012,6 +9413,9 @@
               <w:pStyle w:val="Compact"/>
             </w:pPr>
             <w:r>
+              <w:rPr>
+                <w:highlight w:val="yellow"/>
+              </w:rPr>
               <w:t xml:space="preserve">An accidental apply rebuilds a server. An accidental destroy is an outage. Destruction is a deliberate act on the runner that owns that environment.</w:t>
             </w:r>
           </w:p>
@@ -9036,6 +9440,9 @@
               <w:pStyle w:val="Compact"/>
             </w:pPr>
             <w:r>
+              <w:rPr>
+                <w:highlight w:val="yellow"/>
+              </w:rPr>
               <w:t xml:space="preserve">Start from what an auditor will ask for, remove anything a developer cannot act on, and keep it short enough that people read it. Ten in dev, fourteen in stage and prod. It is version controlled, so changing it is a reviewed change.</w:t>
             </w:r>
           </w:p>
@@ -9060,6 +9467,9 @@
               <w:pStyle w:val="Compact"/>
             </w:pPr>
             <w:r>
+              <w:rPr>
+                <w:highlight w:val="yellow"/>
+              </w:rPr>
               <w:t xml:space="preserve">Runtime security, image and dependency scanning, disaster recovery of the host itself, and a second engineer to approve. Doc 6 has the honest list.</w:t>
             </w:r>
           </w:p>
@@ -9084,22 +9494,35 @@
               <w:pStyle w:val="Compact"/>
             </w:pPr>
             <w:r>
+              <w:rPr>
+                <w:highlight w:val="yellow"/>
+              </w:rPr>
               <w:t xml:space="preserve">Today the count is a number in a file, changed by a reviewed pull request - declarative, not automatic. Real autoscaling means workloads appearing with no human in the loop, so the gate has to move from CI to admission: Gatekeeper or Kyverno enforcing the same policies in the cluster. I would add that</w:t>
             </w:r>
             <w:r>
+              <w:rPr>
+                <w:highlight w:val="yellow"/>
+              </w:rPr>
               <w:t xml:space="preserve"> </w:t>
             </w:r>
             <w:r>
               <w:rPr>
                 <w:i/>
                 <w:iCs/>
+                <w:highlight w:val="yellow"/>
               </w:rPr>
               <w:t xml:space="preserve">before</w:t>
             </w:r>
             <w:r>
+              <w:rPr>
+                <w:highlight w:val="yellow"/>
+              </w:rPr>
               <w:t xml:space="preserve"> </w:t>
             </w:r>
             <w:r>
+              <w:rPr>
+                <w:highlight w:val="yellow"/>
+              </w:rPr>
               <w:t xml:space="preserve">an autoscaler, not after. And I would scale on queue depth or p95 latency, not CPU, which is the default and the wrong signal for a claims API.</w:t>
             </w:r>
           </w:p>
@@ -9124,6 +9547,9 @@
               <w:pStyle w:val="Compact"/>
             </w:pPr>
             <w:r>
+              <w:rPr>
+                <w:highlight w:val="yellow"/>
+              </w:rPr>
               <w:t xml:space="preserve">The real reason to want an image is not scale, it is that an image can be scanned for known vulnerabilities before it runs - Trivy. That is the next gate I would add, and it works with or without Kubernetes. The application here is one Python file; containerising it buys a scannable artifact and nothing else yet.</w:t>
             </w:r>
           </w:p>
@@ -9148,36 +9574,59 @@
               <w:pStyle w:val="Compact"/>
             </w:pPr>
             <w:r>
+              <w:rPr>
+                <w:highlight w:val="yellow"/>
+              </w:rPr>
               <w:t xml:space="preserve">Plenty, and it is written down. The first version put a container on the gateway address because I derived the host octet from the VMID. A single</w:t>
             </w:r>
             <w:r>
+              <w:rPr>
+                <w:highlight w:val="yellow"/>
+              </w:rPr>
               <w:t xml:space="preserve"> </w:t>
             </w:r>
             <w:r>
               <w:rPr>
                 <w:rStyle w:val="VerbatimChar"/>
+                <w:highlight w:val="yellow"/>
               </w:rPr>
               <w:t xml:space="preserve">ping -W 1</w:t>
             </w:r>
             <w:r>
+              <w:rPr>
+                <w:highlight w:val="yellow"/>
+              </w:rPr>
               <w:t xml:space="preserve"> </w:t>
             </w:r>
             <w:r>
+              <w:rPr>
+                <w:highlight w:val="yellow"/>
+              </w:rPr>
               <w:t xml:space="preserve">against a cold ARP cache told me the gateways were dead when they were fine. Editing a NIC without</w:t>
             </w:r>
             <w:r>
+              <w:rPr>
+                <w:highlight w:val="yellow"/>
+              </w:rPr>
               <w:t xml:space="preserve"> </w:t>
             </w:r>
             <w:r>
               <w:rPr>
                 <w:rStyle w:val="VerbatimChar"/>
+                <w:highlight w:val="yellow"/>
               </w:rPr>
               <w:t xml:space="preserve">hwaddr=</w:t>
             </w:r>
             <w:r>
+              <w:rPr>
+                <w:highlight w:val="yellow"/>
+              </w:rPr>
               <w:t xml:space="preserve"> </w:t>
             </w:r>
             <w:r>
+              <w:rPr>
+                <w:highlight w:val="yellow"/>
+              </w:rPr>
               <w:t xml:space="preserve">regenerated the MAC and stranded the container. The per-container firewall silently dropped return traffic. Doc 7 has the table. Each one has a general lesson, and each cost real time.</w:t>
             </w:r>
           </w:p>
@@ -10595,21 +11044,12 @@
         <w:pStyle w:val="BlockText"/>
       </w:pPr>
       <w:r>
-        <w:rPr>
-          <w:highlight w:val="yellow"/>
-        </w:rPr>
         <w:t xml:space="preserve">"A single boundary is one mistake away from nothing. Three independent ones mean an attacker needs</w:t>
       </w:r>
       <w:r>
-        <w:rPr>
-          <w:highlight w:val="yellow"/>
-        </w:rPr>
-        <w:t xml:space="preserve"> </w:t>
-      </w:r>
-      <w:r>
-        <w:rPr>
-          <w:highlight w:val="yellow"/>
-        </w:rPr>
+        <w:t xml:space="preserve"> </w:t>
+      </w:r>
+      <w:r>
         <w:t xml:space="preserve">three independent mistakes."</w:t>
       </w:r>
     </w:p>
@@ -14673,21 +15113,12 @@
         <w:pStyle w:val="BlockText"/>
       </w:pPr>
       <w:r>
-        <w:rPr>
-          <w:highlight w:val="yellow"/>
-        </w:rPr>
         <w:t xml:space="preserve">"Production refused to be deleted by automation. A human had to disarm it on purpose. That is the</w:t>
       </w:r>
       <w:r>
-        <w:rPr>
-          <w:highlight w:val="yellow"/>
-        </w:rPr>
-        <w:t xml:space="preserve"> </w:t>
-      </w:r>
-      <w:r>
-        <w:rPr>
-          <w:highlight w:val="yellow"/>
-        </w:rPr>
+        <w:t xml:space="preserve"> </w:t>
+      </w:r>
+      <w:r>
         <w:t xml:space="preserve">difference between dev and prod in one error message."</w:t>
       </w:r>
     </w:p>

</xml_diff>